<commit_message>
📝 Update/Upload Activity_II doc/pdf
</commit_message>
<xml_diff>
--- a/Activity_II-LogAnalysis/Activity_II-Solution.docx
+++ b/Activity_II-LogAnalysis/Activity_II-Solution.docx
@@ -155,7 +155,6 @@
     </w:p>
     <w:p>
       <w:pPr>
-        <w:spacing w:line="360" w:lineRule="auto"/>
         <w:rPr>
           <w:rFonts w:ascii="Times New Roman" w:hAnsi="Times New Roman" w:cs="Times New Roman"/>
         </w:rPr>
@@ -196,14 +195,13 @@
         </w:rPr>
         <w:t>Q1. How many hackers are trying to get access to our servers? And how many</w:t>
       </w:r>
-    </w:p>
-    <w:p>
-      <w:pPr>
-        <w:spacing w:line="360" w:lineRule="auto"/>
-        <w:rPr>
-          <w:rFonts w:ascii="Times New Roman" w:hAnsi="Times New Roman" w:cs="Times New Roman"/>
-        </w:rPr>
-      </w:pPr>
+      <w:r>
+        <w:rPr>
+          <w:rFonts w:ascii="Times New Roman" w:hAnsi="Times New Roman" w:cs="Times New Roman"/>
+          <w:lang w:val="en-US"/>
+        </w:rPr>
+        <w:t xml:space="preserve"> </w:t>
+      </w:r>
       <w:r>
         <w:rPr>
           <w:rFonts w:ascii="Times New Roman" w:hAnsi="Times New Roman" w:cs="Times New Roman"/>
@@ -213,20 +211,71 @@
     </w:p>
     <w:p>
       <w:pPr>
-        <w:spacing w:line="360" w:lineRule="auto"/>
-        <w:rPr>
-          <w:rFonts w:ascii="Times New Roman" w:hAnsi="Times New Roman" w:cs="Times New Roman"/>
-        </w:rPr>
-      </w:pPr>
-      <w:r>
-        <w:rPr>
-          <w:rFonts w:ascii="Times New Roman" w:hAnsi="Times New Roman" w:cs="Times New Roman"/>
+        <w:pStyle w:val="ListParagraph"/>
+        <w:numPr>
+          <w:ilvl w:val="0"/>
+          <w:numId w:val="4"/>
+        </w:numPr>
+        <w:spacing w:line="360" w:lineRule="auto"/>
+        <w:rPr>
+          <w:rFonts w:ascii="Times New Roman" w:hAnsi="Times New Roman" w:cs="Times New Roman"/>
+          <w:color w:val="4472C4" w:themeColor="accent1"/>
+          <w:lang w:val="en-US"/>
+        </w:rPr>
+      </w:pPr>
+      <w:r>
+        <w:rPr>
+          <w:rFonts w:ascii="Times New Roman" w:hAnsi="Times New Roman" w:cs="Times New Roman"/>
+          <w:color w:val="4472C4" w:themeColor="accent1"/>
+          <w:lang w:val="en-US"/>
+        </w:rPr>
+        <w:t>182 hackers.</w:t>
+      </w:r>
+    </w:p>
+    <w:p>
+      <w:pPr>
+        <w:pStyle w:val="ListParagraph"/>
+        <w:numPr>
+          <w:ilvl w:val="0"/>
+          <w:numId w:val="4"/>
+        </w:numPr>
+        <w:spacing w:line="360" w:lineRule="auto"/>
+        <w:rPr>
+          <w:rFonts w:ascii="Times New Roman" w:hAnsi="Times New Roman" w:cs="Times New Roman"/>
+          <w:color w:val="4472C4" w:themeColor="accent1"/>
+          <w:lang w:val="en-US"/>
+        </w:rPr>
+      </w:pPr>
+      <w:r>
+        <w:rPr>
+          <w:rFonts w:ascii="Times New Roman" w:hAnsi="Times New Roman" w:cs="Times New Roman"/>
+          <w:color w:val="4472C4" w:themeColor="accent1"/>
+          <w:lang w:val="en-US"/>
+        </w:rPr>
+        <w:t>33,253 events</w:t>
+      </w:r>
+    </w:p>
+    <w:p>
+      <w:pPr>
+        <w:spacing w:line="360" w:lineRule="auto"/>
+        <w:ind w:left="360"/>
+        <w:rPr>
+          <w:rFonts w:ascii="Times New Roman" w:hAnsi="Times New Roman" w:cs="Times New Roman"/>
+          <w:color w:val="4472C4" w:themeColor="accent1"/>
+          <w:lang w:val="en-US"/>
+        </w:rPr>
+      </w:pPr>
+      <w:r>
+        <w:rPr>
+          <w:rFonts w:ascii="Times New Roman" w:hAnsi="Times New Roman" w:cs="Times New Roman"/>
+          <w:color w:val="4472C4" w:themeColor="accent1"/>
+          <w:lang w:val="en-US"/>
         </w:rPr>
         <w:drawing>
-          <wp:inline distT="0" distB="0" distL="0" distR="0" wp14:anchorId="7E17D026" wp14:editId="4BCCF01F">
-            <wp:extent cx="5252224" cy="3045841"/>
-            <wp:effectExtent l="0" t="0" r="5715" b="2540"/>
-            <wp:docPr id="1" name="Picture 1" descr="Graphical user interface, application, Teams&#10;&#10;Description automatically generated"/>
+          <wp:inline distT="0" distB="0" distL="0" distR="0" wp14:anchorId="0F3F54CF" wp14:editId="4B928AE8">
+            <wp:extent cx="5943600" cy="3181985"/>
+            <wp:effectExtent l="0" t="0" r="0" b="5715"/>
+            <wp:docPr id="16" name="Picture 16" descr="Graphical user interface, application&#10;&#10;Description automatically generated"/>
             <wp:cNvGraphicFramePr>
               <a:graphicFrameLocks xmlns:a="http://schemas.openxmlformats.org/drawingml/2006/main" noChangeAspect="1"/>
             </wp:cNvGraphicFramePr>
@@ -234,7 +283,7 @@
               <a:graphicData uri="http://schemas.openxmlformats.org/drawingml/2006/picture">
                 <pic:pic xmlns:pic="http://schemas.openxmlformats.org/drawingml/2006/picture">
                   <pic:nvPicPr>
-                    <pic:cNvPr id="1" name="Picture 1" descr="Graphical user interface, application, Teams&#10;&#10;Description automatically generated"/>
+                    <pic:cNvPr id="16" name="Picture 16" descr="Graphical user interface, application&#10;&#10;Description automatically generated"/>
                     <pic:cNvPicPr/>
                   </pic:nvPicPr>
                   <pic:blipFill>
@@ -246,7 +295,7 @@
                   <pic:spPr>
                     <a:xfrm>
                       <a:off x="0" y="0"/>
-                      <a:ext cx="5265148" cy="3053336"/>
+                      <a:ext cx="5943600" cy="3181985"/>
                     </a:xfrm>
                     <a:prstGeom prst="rect">
                       <a:avLst/>
@@ -264,145 +313,76 @@
         <w:pStyle w:val="ListParagraph"/>
         <w:numPr>
           <w:ilvl w:val="0"/>
-          <w:numId w:val="3"/>
+          <w:numId w:val="4"/>
         </w:numPr>
         <w:spacing w:line="360" w:lineRule="auto"/>
         <w:rPr>
           <w:rFonts w:ascii="Times New Roman" w:hAnsi="Times New Roman" w:cs="Times New Roman"/>
-          <w:lang w:val="en-US"/>
-        </w:rPr>
-      </w:pPr>
-      <w:r>
-        <w:rPr>
-          <w:rFonts w:ascii="Times New Roman" w:hAnsi="Times New Roman" w:cs="Times New Roman"/>
-          <w:lang w:val="en-US"/>
-        </w:rPr>
-        <w:t>D</w:t>
-      </w:r>
-    </w:p>
-    <w:p>
-      <w:pPr>
-        <w:spacing w:line="360" w:lineRule="auto"/>
-        <w:rPr>
-          <w:rFonts w:ascii="Times New Roman" w:hAnsi="Times New Roman" w:cs="Times New Roman"/>
-          <w:lang w:val="en-US"/>
-        </w:rPr>
-      </w:pPr>
-    </w:p>
-    <w:p>
-      <w:pPr>
-        <w:spacing w:line="360" w:lineRule="auto"/>
-        <w:rPr>
-          <w:rFonts w:ascii="Times New Roman" w:hAnsi="Times New Roman" w:cs="Times New Roman"/>
-        </w:rPr>
-      </w:pPr>
-      <w:r>
-        <w:rPr>
-          <w:rFonts w:ascii="Times New Roman" w:hAnsi="Times New Roman" w:cs="Times New Roman"/>
+          <w:color w:val="4472C4" w:themeColor="accent1"/>
+          <w:lang w:val="en-US"/>
+        </w:rPr>
+      </w:pPr>
+      <w:r>
+        <w:rPr>
+          <w:rFonts w:ascii="Times New Roman" w:hAnsi="Times New Roman" w:cs="Times New Roman"/>
+          <w:color w:val="4472C4" w:themeColor="accent1"/>
+          <w:lang w:val="en-US"/>
         </w:rPr>
         <w:lastRenderedPageBreak/>
-        <w:t>Q2. What time do hackers appear to try to hack our servers?</w:t>
-      </w:r>
+        <w:t xml:space="preserve">From extracting fields of username, and </w:t>
+      </w:r>
+      <w:proofErr w:type="spellStart"/>
+      <w:r>
+        <w:rPr>
+          <w:rFonts w:ascii="Times New Roman" w:hAnsi="Times New Roman" w:cs="Times New Roman"/>
+          <w:color w:val="4472C4" w:themeColor="accent1"/>
+          <w:lang w:val="en-US"/>
+        </w:rPr>
+        <w:t>ip_address</w:t>
+      </w:r>
+      <w:proofErr w:type="spellEnd"/>
+      <w:r>
+        <w:rPr>
+          <w:rFonts w:ascii="Times New Roman" w:hAnsi="Times New Roman" w:cs="Times New Roman"/>
+          <w:color w:val="4472C4" w:themeColor="accent1"/>
+          <w:lang w:val="en-US"/>
+        </w:rPr>
+        <w:t xml:space="preserve"> from log lines which are logging text with ‘Failed password’, I filter</w:t>
+      </w:r>
+      <w:r>
+        <w:rPr>
+          <w:rFonts w:ascii="Times New Roman" w:hAnsi="Times New Roman" w:cs="Times New Roman"/>
+          <w:color w:val="4472C4" w:themeColor="accent1"/>
+          <w:lang w:val="en-US"/>
+        </w:rPr>
+        <w:t xml:space="preserve">ed only hackers sorting by the number of usernames they had sent to login, but not succeed. There are 3 real users (id = {183, 184, 185}) who </w:t>
+      </w:r>
+      <w:r>
+        <w:rPr>
+          <w:rFonts w:ascii="Times New Roman" w:hAnsi="Times New Roman" w:cs="Times New Roman"/>
+          <w:color w:val="4472C4" w:themeColor="accent1"/>
+          <w:lang w:val="en-US"/>
+        </w:rPr>
+        <w:t>were trying to login with wrong password inputted.</w:t>
+      </w:r>
+    </w:p>
+    <w:p>
+      <w:pPr>
+        <w:spacing w:line="360" w:lineRule="auto"/>
+        <w:ind w:left="360"/>
+        <w:rPr>
+          <w:rFonts w:ascii="Times New Roman" w:hAnsi="Times New Roman" w:cs="Times New Roman"/>
+          <w:color w:val="4472C4" w:themeColor="accent1"/>
+          <w:lang w:val="en-US"/>
+        </w:rPr>
+      </w:pPr>
     </w:p>
     <w:p>
       <w:pPr>
         <w:pStyle w:val="ListParagraph"/>
-        <w:numPr>
-          <w:ilvl w:val="0"/>
-          <w:numId w:val="2"/>
-        </w:numPr>
-        <w:spacing w:line="360" w:lineRule="auto"/>
-        <w:rPr>
-          <w:rFonts w:ascii="Times New Roman" w:hAnsi="Times New Roman" w:cs="Times New Roman"/>
-          <w:lang w:val="en-US"/>
-        </w:rPr>
-      </w:pPr>
-      <w:r>
-        <w:rPr>
-          <w:rFonts w:ascii="Times New Roman" w:hAnsi="Times New Roman" w:cs="Times New Roman"/>
-          <w:lang w:val="en-US"/>
-        </w:rPr>
-        <w:t>D</w:t>
-      </w:r>
-    </w:p>
-    <w:p>
-      <w:pPr>
-        <w:spacing w:line="360" w:lineRule="auto"/>
-        <w:rPr>
-          <w:rFonts w:ascii="Times New Roman" w:hAnsi="Times New Roman" w:cs="Times New Roman"/>
-          <w:lang w:val="en-US"/>
-        </w:rPr>
-      </w:pPr>
-    </w:p>
-    <w:p>
-      <w:pPr>
-        <w:spacing w:line="360" w:lineRule="auto"/>
-        <w:rPr>
-          <w:rFonts w:ascii="Times New Roman" w:hAnsi="Times New Roman" w:cs="Times New Roman"/>
-        </w:rPr>
-      </w:pPr>
-      <w:r>
-        <w:rPr>
-          <w:rFonts w:ascii="Times New Roman" w:hAnsi="Times New Roman" w:cs="Times New Roman"/>
-        </w:rPr>
-        <w:t>Q3. Which server (mailsv, www1, www2, www3) sees the most attempts?</w:t>
-      </w:r>
-    </w:p>
-    <w:p>
-      <w:pPr>
-        <w:pStyle w:val="ListParagraph"/>
-        <w:numPr>
-          <w:ilvl w:val="0"/>
-          <w:numId w:val="2"/>
-        </w:numPr>
-        <w:spacing w:line="360" w:lineRule="auto"/>
-        <w:rPr>
-          <w:rFonts w:ascii="Times New Roman" w:hAnsi="Times New Roman" w:cs="Times New Roman"/>
-          <w:lang w:val="en-US"/>
-        </w:rPr>
-      </w:pPr>
-    </w:p>
-    <w:p>
-      <w:pPr>
-        <w:spacing w:line="360" w:lineRule="auto"/>
-        <w:rPr>
-          <w:rFonts w:ascii="Times New Roman" w:hAnsi="Times New Roman" w:cs="Times New Roman"/>
-        </w:rPr>
-      </w:pPr>
-      <w:r>
-        <w:rPr>
-          <w:rFonts w:ascii="Times New Roman" w:hAnsi="Times New Roman" w:cs="Times New Roman"/>
-        </w:rPr>
-        <w:t>Q4. What is the most popular account that hackers use to try to break in?</w:t>
-      </w:r>
-    </w:p>
-    <w:p>
-      <w:pPr>
-        <w:pStyle w:val="ListParagraph"/>
-        <w:numPr>
-          <w:ilvl w:val="0"/>
-          <w:numId w:val="2"/>
-        </w:numPr>
-        <w:spacing w:line="360" w:lineRule="auto"/>
-        <w:rPr>
-          <w:rFonts w:ascii="Times New Roman" w:hAnsi="Times New Roman" w:cs="Times New Roman"/>
-          <w:lang w:val="en-US"/>
-        </w:rPr>
-      </w:pPr>
-      <w:r>
-        <w:rPr>
-          <w:rFonts w:ascii="Times New Roman" w:hAnsi="Times New Roman" w:cs="Times New Roman"/>
-          <w:lang w:val="en-US"/>
-        </w:rPr>
-        <w:t>‘administrator’</w:t>
-      </w:r>
-    </w:p>
-    <w:p>
-      <w:pPr>
-        <w:spacing w:line="360" w:lineRule="auto"/>
-        <w:rPr>
-          <w:rFonts w:ascii="Times New Roman" w:hAnsi="Times New Roman" w:cs="Times New Roman"/>
-          <w:cs/>
+        <w:spacing w:line="360" w:lineRule="auto"/>
+        <w:rPr>
+          <w:rFonts w:ascii="Times New Roman" w:hAnsi="Times New Roman" w:cs="Times New Roman"/>
           <w:lang w:val="en-US"/>
         </w:rPr>
       </w:pPr>
@@ -412,10 +392,10 @@
           <w:lang w:val="en-US"/>
         </w:rPr>
         <w:drawing>
-          <wp:inline distT="0" distB="0" distL="0" distR="0" wp14:anchorId="7EA8725B" wp14:editId="09C37A51">
-            <wp:extent cx="5943600" cy="4191635"/>
-            <wp:effectExtent l="0" t="0" r="0" b="0"/>
-            <wp:docPr id="2" name="Picture 2" descr="Chart, line chart&#10;&#10;Description automatically generated"/>
+          <wp:inline distT="0" distB="0" distL="0" distR="0" wp14:anchorId="44673AB7" wp14:editId="12FB5F40">
+            <wp:extent cx="5943600" cy="2245360"/>
+            <wp:effectExtent l="0" t="0" r="0" b="2540"/>
+            <wp:docPr id="1" name="Picture 1" descr="A picture containing timeline&#10;&#10;Description automatically generated"/>
             <wp:cNvGraphicFramePr>
               <a:graphicFrameLocks xmlns:a="http://schemas.openxmlformats.org/drawingml/2006/main" noChangeAspect="1"/>
             </wp:cNvGraphicFramePr>
@@ -423,7 +403,7 @@
               <a:graphicData uri="http://schemas.openxmlformats.org/drawingml/2006/picture">
                 <pic:pic xmlns:pic="http://schemas.openxmlformats.org/drawingml/2006/picture">
                   <pic:nvPicPr>
-                    <pic:cNvPr id="2" name="Picture 2" descr="Chart, line chart&#10;&#10;Description automatically generated"/>
+                    <pic:cNvPr id="1" name="Picture 1" descr="A picture containing timeline&#10;&#10;Description automatically generated"/>
                     <pic:cNvPicPr/>
                   </pic:nvPicPr>
                   <pic:blipFill>
@@ -435,7 +415,7 @@
                   <pic:spPr>
                     <a:xfrm>
                       <a:off x="0" y="0"/>
-                      <a:ext cx="5943600" cy="4191635"/>
+                      <a:ext cx="5943600" cy="2245360"/>
                     </a:xfrm>
                     <a:prstGeom prst="rect">
                       <a:avLst/>
@@ -450,6 +430,701 @@
     </w:p>
     <w:p>
       <w:pPr>
+        <w:pStyle w:val="ListParagraph"/>
+        <w:spacing w:line="360" w:lineRule="auto"/>
+        <w:rPr>
+          <w:rFonts w:ascii="Times New Roman" w:hAnsi="Times New Roman" w:cs="Times New Roman"/>
+          <w:lang w:val="en-US"/>
+        </w:rPr>
+      </w:pPr>
+    </w:p>
+    <w:p>
+      <w:pPr>
+        <w:pStyle w:val="ListParagraph"/>
+        <w:spacing w:line="360" w:lineRule="auto"/>
+        <w:rPr>
+          <w:rFonts w:ascii="Times New Roman" w:hAnsi="Times New Roman" w:cs="Times New Roman"/>
+          <w:lang w:val="en-US"/>
+        </w:rPr>
+      </w:pPr>
+      <w:r>
+        <w:rPr>
+          <w:rFonts w:ascii="Times New Roman" w:hAnsi="Times New Roman" w:cs="Times New Roman"/>
+          <w:lang w:val="en-US"/>
+        </w:rPr>
+        <w:drawing>
+          <wp:inline distT="0" distB="0" distL="0" distR="0" wp14:anchorId="63B1B823" wp14:editId="4BF51587">
+            <wp:extent cx="5943600" cy="927735"/>
+            <wp:effectExtent l="0" t="0" r="0" b="0"/>
+            <wp:docPr id="5" name="Picture 5" descr="Background pattern&#10;&#10;Description automatically generated"/>
+            <wp:cNvGraphicFramePr>
+              <a:graphicFrameLocks xmlns:a="http://schemas.openxmlformats.org/drawingml/2006/main" noChangeAspect="1"/>
+            </wp:cNvGraphicFramePr>
+            <a:graphic xmlns:a="http://schemas.openxmlformats.org/drawingml/2006/main">
+              <a:graphicData uri="http://schemas.openxmlformats.org/drawingml/2006/picture">
+                <pic:pic xmlns:pic="http://schemas.openxmlformats.org/drawingml/2006/picture">
+                  <pic:nvPicPr>
+                    <pic:cNvPr id="5" name="Picture 5" descr="Background pattern&#10;&#10;Description automatically generated"/>
+                    <pic:cNvPicPr/>
+                  </pic:nvPicPr>
+                  <pic:blipFill>
+                    <a:blip r:embed="rId8"/>
+                    <a:stretch>
+                      <a:fillRect/>
+                    </a:stretch>
+                  </pic:blipFill>
+                  <pic:spPr>
+                    <a:xfrm>
+                      <a:off x="0" y="0"/>
+                      <a:ext cx="5943600" cy="927735"/>
+                    </a:xfrm>
+                    <a:prstGeom prst="rect">
+                      <a:avLst/>
+                    </a:prstGeom>
+                  </pic:spPr>
+                </pic:pic>
+              </a:graphicData>
+            </a:graphic>
+          </wp:inline>
+        </w:drawing>
+      </w:r>
+    </w:p>
+    <w:p>
+      <w:pPr>
+        <w:spacing w:line="360" w:lineRule="auto"/>
+        <w:rPr>
+          <w:rFonts w:ascii="Times New Roman" w:hAnsi="Times New Roman" w:cs="Times New Roman"/>
+          <w:lang w:val="en-US"/>
+        </w:rPr>
+      </w:pPr>
+    </w:p>
+    <w:p>
+      <w:pPr>
+        <w:rPr>
+          <w:rFonts w:ascii="Times New Roman" w:hAnsi="Times New Roman" w:cs="Times New Roman"/>
+        </w:rPr>
+      </w:pPr>
+    </w:p>
+    <w:p>
+      <w:pPr>
+        <w:rPr>
+          <w:rFonts w:ascii="Times New Roman" w:hAnsi="Times New Roman" w:cs="Times New Roman"/>
+        </w:rPr>
+      </w:pPr>
+      <w:r>
+        <w:rPr>
+          <w:rFonts w:ascii="Times New Roman" w:hAnsi="Times New Roman" w:cs="Times New Roman"/>
+        </w:rPr>
+        <w:br w:type="page"/>
+      </w:r>
+    </w:p>
+    <w:p>
+      <w:pPr>
+        <w:spacing w:line="360" w:lineRule="auto"/>
+        <w:rPr>
+          <w:rFonts w:ascii="Times New Roman" w:hAnsi="Times New Roman" w:cs="Times New Roman"/>
+        </w:rPr>
+      </w:pPr>
+      <w:r>
+        <w:rPr>
+          <w:rFonts w:ascii="Times New Roman" w:hAnsi="Times New Roman" w:cs="Times New Roman"/>
+        </w:rPr>
+        <w:lastRenderedPageBreak/>
+        <w:t>Q2. What time do hackers appear to try to hack our servers?</w:t>
+      </w:r>
+    </w:p>
+    <w:p>
+      <w:pPr>
+        <w:pStyle w:val="ListParagraph"/>
+        <w:numPr>
+          <w:ilvl w:val="0"/>
+          <w:numId w:val="4"/>
+        </w:numPr>
+        <w:spacing w:line="360" w:lineRule="auto"/>
+        <w:rPr>
+          <w:rFonts w:ascii="Times New Roman" w:hAnsi="Times New Roman" w:cs="Times New Roman"/>
+          <w:color w:val="4472C4" w:themeColor="accent1"/>
+          <w:lang w:val="en-US"/>
+        </w:rPr>
+      </w:pPr>
+      <w:r>
+        <w:rPr>
+          <w:rFonts w:ascii="Times New Roman" w:hAnsi="Times New Roman" w:cs="Times New Roman"/>
+          <w:color w:val="4472C4" w:themeColor="accent1"/>
+          <w:lang w:val="en-US"/>
+        </w:rPr>
+        <w:t>The hackers usually attempted to brute-force at 0:15 AM over those 7 days.</w:t>
+      </w:r>
+    </w:p>
+    <w:p>
+      <w:pPr>
+        <w:spacing w:line="360" w:lineRule="auto"/>
+        <w:rPr>
+          <w:rFonts w:ascii="Times New Roman" w:hAnsi="Times New Roman" w:cs="Times New Roman"/>
+          <w:lang w:val="en-US"/>
+        </w:rPr>
+      </w:pPr>
+    </w:p>
+    <w:p>
+      <w:pPr>
+        <w:spacing w:line="360" w:lineRule="auto"/>
+        <w:rPr>
+          <w:rFonts w:ascii="Times New Roman" w:hAnsi="Times New Roman" w:cs="Times New Roman"/>
+          <w:lang w:val="en-US"/>
+        </w:rPr>
+      </w:pPr>
+      <w:r>
+        <w:rPr>
+          <w:rFonts w:ascii="Times New Roman" w:hAnsi="Times New Roman" w:cs="Times New Roman"/>
+          <w:lang w:val="en-US"/>
+        </w:rPr>
+        <w:drawing>
+          <wp:inline distT="0" distB="0" distL="0" distR="0" wp14:anchorId="5036BD48" wp14:editId="6B28F9BD">
+            <wp:extent cx="5876290" cy="2986200"/>
+            <wp:effectExtent l="0" t="0" r="3810" b="0"/>
+            <wp:docPr id="9" name="Picture 9" descr="Graphical user interface, text, application&#10;&#10;Description automatically generated"/>
+            <wp:cNvGraphicFramePr>
+              <a:graphicFrameLocks xmlns:a="http://schemas.openxmlformats.org/drawingml/2006/main" noChangeAspect="1"/>
+            </wp:cNvGraphicFramePr>
+            <a:graphic xmlns:a="http://schemas.openxmlformats.org/drawingml/2006/main">
+              <a:graphicData uri="http://schemas.openxmlformats.org/drawingml/2006/picture">
+                <pic:pic xmlns:pic="http://schemas.openxmlformats.org/drawingml/2006/picture">
+                  <pic:nvPicPr>
+                    <pic:cNvPr id="9" name="Picture 9" descr="Graphical user interface, text, application&#10;&#10;Description automatically generated"/>
+                    <pic:cNvPicPr/>
+                  </pic:nvPicPr>
+                  <pic:blipFill rotWithShape="1">
+                    <a:blip r:embed="rId9"/>
+                    <a:srcRect l="1126" r="1"/>
+                    <a:stretch/>
+                  </pic:blipFill>
+                  <pic:spPr bwMode="auto">
+                    <a:xfrm>
+                      <a:off x="0" y="0"/>
+                      <a:ext cx="5876693" cy="2986405"/>
+                    </a:xfrm>
+                    <a:prstGeom prst="rect">
+                      <a:avLst/>
+                    </a:prstGeom>
+                    <a:ln>
+                      <a:noFill/>
+                    </a:ln>
+                    <a:extLst>
+                      <a:ext uri="{53640926-AAD7-44D8-BBD7-CCE9431645EC}">
+                        <a14:shadowObscured xmlns:a14="http://schemas.microsoft.com/office/drawing/2010/main"/>
+                      </a:ext>
+                    </a:extLst>
+                  </pic:spPr>
+                </pic:pic>
+              </a:graphicData>
+            </a:graphic>
+          </wp:inline>
+        </w:drawing>
+      </w:r>
+    </w:p>
+    <w:p>
+      <w:pPr>
+        <w:spacing w:line="360" w:lineRule="auto"/>
+        <w:rPr>
+          <w:rFonts w:ascii="Times New Roman" w:hAnsi="Times New Roman" w:cs="Times New Roman"/>
+          <w:lang w:val="en-US"/>
+        </w:rPr>
+      </w:pPr>
+    </w:p>
+    <w:p>
+      <w:pPr>
+        <w:spacing w:line="360" w:lineRule="auto"/>
+        <w:rPr>
+          <w:rFonts w:ascii="Times New Roman" w:hAnsi="Times New Roman" w:cs="Times New Roman"/>
+          <w:lang w:val="en-US"/>
+        </w:rPr>
+      </w:pPr>
+      <w:r>
+        <w:rPr>
+          <w:rFonts w:ascii="Times New Roman" w:hAnsi="Times New Roman" w:cs="Times New Roman"/>
+          <w:lang w:val="en-US"/>
+        </w:rPr>
+        <w:drawing>
+          <wp:inline distT="0" distB="0" distL="0" distR="0" wp14:anchorId="046D3876" wp14:editId="0DB47E89">
+            <wp:extent cx="5809785" cy="2956560"/>
+            <wp:effectExtent l="0" t="0" r="0" b="2540"/>
+            <wp:docPr id="10" name="Picture 10" descr="Graphical user interface, text, application&#10;&#10;Description automatically generated"/>
+            <wp:cNvGraphicFramePr>
+              <a:graphicFrameLocks xmlns:a="http://schemas.openxmlformats.org/drawingml/2006/main" noChangeAspect="1"/>
+            </wp:cNvGraphicFramePr>
+            <a:graphic xmlns:a="http://schemas.openxmlformats.org/drawingml/2006/main">
+              <a:graphicData uri="http://schemas.openxmlformats.org/drawingml/2006/picture">
+                <pic:pic xmlns:pic="http://schemas.openxmlformats.org/drawingml/2006/picture">
+                  <pic:nvPicPr>
+                    <pic:cNvPr id="10" name="Picture 10" descr="Graphical user interface, text, application&#10;&#10;Description automatically generated"/>
+                    <pic:cNvPicPr/>
+                  </pic:nvPicPr>
+                  <pic:blipFill rotWithShape="1">
+                    <a:blip r:embed="rId10"/>
+                    <a:srcRect l="1126" r="1106"/>
+                    <a:stretch/>
+                  </pic:blipFill>
+                  <pic:spPr bwMode="auto">
+                    <a:xfrm>
+                      <a:off x="0" y="0"/>
+                      <a:ext cx="5811033" cy="2957195"/>
+                    </a:xfrm>
+                    <a:prstGeom prst="rect">
+                      <a:avLst/>
+                    </a:prstGeom>
+                    <a:ln>
+                      <a:noFill/>
+                    </a:ln>
+                    <a:extLst>
+                      <a:ext uri="{53640926-AAD7-44D8-BBD7-CCE9431645EC}">
+                        <a14:shadowObscured xmlns:a14="http://schemas.microsoft.com/office/drawing/2010/main"/>
+                      </a:ext>
+                    </a:extLst>
+                  </pic:spPr>
+                </pic:pic>
+              </a:graphicData>
+            </a:graphic>
+          </wp:inline>
+        </w:drawing>
+      </w:r>
+    </w:p>
+    <w:p>
+      <w:pPr>
+        <w:spacing w:line="360" w:lineRule="auto"/>
+        <w:rPr>
+          <w:rFonts w:ascii="Times New Roman" w:hAnsi="Times New Roman" w:cs="Times New Roman"/>
+          <w:lang w:val="en-US"/>
+        </w:rPr>
+      </w:pPr>
+      <w:r>
+        <w:rPr>
+          <w:rFonts w:ascii="Times New Roman" w:hAnsi="Times New Roman" w:cs="Times New Roman"/>
+          <w:lang w:val="en-US"/>
+        </w:rPr>
+        <w:lastRenderedPageBreak/>
+        <w:drawing>
+          <wp:inline distT="0" distB="0" distL="0" distR="0" wp14:anchorId="6CB837F5" wp14:editId="02793843">
+            <wp:extent cx="5887844" cy="3796665"/>
+            <wp:effectExtent l="0" t="0" r="5080" b="635"/>
+            <wp:docPr id="8" name="Picture 8" descr="Table&#10;&#10;Description automatically generated"/>
+            <wp:cNvGraphicFramePr>
+              <a:graphicFrameLocks xmlns:a="http://schemas.openxmlformats.org/drawingml/2006/main" noChangeAspect="1"/>
+            </wp:cNvGraphicFramePr>
+            <a:graphic xmlns:a="http://schemas.openxmlformats.org/drawingml/2006/main">
+              <a:graphicData uri="http://schemas.openxmlformats.org/drawingml/2006/picture">
+                <pic:pic xmlns:pic="http://schemas.openxmlformats.org/drawingml/2006/picture">
+                  <pic:nvPicPr>
+                    <pic:cNvPr id="8" name="Picture 8" descr="Table&#10;&#10;Description automatically generated"/>
+                    <pic:cNvPicPr/>
+                  </pic:nvPicPr>
+                  <pic:blipFill rotWithShape="1">
+                    <a:blip r:embed="rId11"/>
+                    <a:srcRect l="938"/>
+                    <a:stretch/>
+                  </pic:blipFill>
+                  <pic:spPr bwMode="auto">
+                    <a:xfrm>
+                      <a:off x="0" y="0"/>
+                      <a:ext cx="5887844" cy="3796665"/>
+                    </a:xfrm>
+                    <a:prstGeom prst="rect">
+                      <a:avLst/>
+                    </a:prstGeom>
+                    <a:ln>
+                      <a:noFill/>
+                    </a:ln>
+                    <a:extLst>
+                      <a:ext uri="{53640926-AAD7-44D8-BBD7-CCE9431645EC}">
+                        <a14:shadowObscured xmlns:a14="http://schemas.microsoft.com/office/drawing/2010/main"/>
+                      </a:ext>
+                    </a:extLst>
+                  </pic:spPr>
+                </pic:pic>
+              </a:graphicData>
+            </a:graphic>
+          </wp:inline>
+        </w:drawing>
+      </w:r>
+    </w:p>
+    <w:p>
+      <w:pPr>
+        <w:spacing w:line="360" w:lineRule="auto"/>
+        <w:rPr>
+          <w:rFonts w:ascii="Times New Roman" w:hAnsi="Times New Roman" w:cs="Times New Roman"/>
+          <w:lang w:val="en-US"/>
+        </w:rPr>
+      </w:pPr>
+    </w:p>
+    <w:p>
+      <w:pPr>
+        <w:spacing w:line="360" w:lineRule="auto"/>
+        <w:rPr>
+          <w:rFonts w:ascii="Times New Roman" w:hAnsi="Times New Roman" w:cs="Times New Roman"/>
+        </w:rPr>
+      </w:pPr>
+      <w:r>
+        <w:rPr>
+          <w:rFonts w:ascii="Times New Roman" w:hAnsi="Times New Roman" w:cs="Times New Roman"/>
+        </w:rPr>
+        <w:t>Q3. Which server (mailsv, www1, www2, www3) sees the most attempts?</w:t>
+      </w:r>
+    </w:p>
+    <w:p>
+      <w:pPr>
+        <w:pStyle w:val="ListParagraph"/>
+        <w:numPr>
+          <w:ilvl w:val="0"/>
+          <w:numId w:val="2"/>
+        </w:numPr>
+        <w:spacing w:line="360" w:lineRule="auto"/>
+        <w:rPr>
+          <w:rFonts w:ascii="Times New Roman" w:hAnsi="Times New Roman" w:cs="Times New Roman"/>
+          <w:color w:val="4472C4" w:themeColor="accent1"/>
+          <w:lang w:val="en-US"/>
+        </w:rPr>
+      </w:pPr>
+      <w:r>
+        <w:rPr>
+          <w:rFonts w:ascii="Times New Roman" w:hAnsi="Times New Roman" w:cs="Times New Roman"/>
+          <w:color w:val="4472C4" w:themeColor="accent1"/>
+          <w:lang w:val="en-US"/>
+        </w:rPr>
+        <w:t>The ww</w:t>
+      </w:r>
+      <w:r>
+        <w:rPr>
+          <w:rFonts w:ascii="Times New Roman" w:hAnsi="Times New Roman" w:cs="Times New Roman"/>
+          <w:color w:val="4472C4" w:themeColor="accent1"/>
+          <w:lang w:val="en-US"/>
+        </w:rPr>
+        <w:t>w</w:t>
+      </w:r>
+      <w:r>
+        <w:rPr>
+          <w:rFonts w:ascii="Times New Roman" w:hAnsi="Times New Roman" w:cs="Times New Roman"/>
+          <w:color w:val="4472C4" w:themeColor="accent1"/>
+          <w:lang w:val="en-US"/>
+        </w:rPr>
+        <w:t>1 server ha</w:t>
+      </w:r>
+      <w:r>
+        <w:rPr>
+          <w:rFonts w:ascii="Times New Roman" w:hAnsi="Times New Roman" w:cs="Times New Roman"/>
+          <w:color w:val="4472C4" w:themeColor="accent1"/>
+          <w:lang w:val="en-US"/>
+        </w:rPr>
+        <w:t>d</w:t>
+      </w:r>
+      <w:r>
+        <w:rPr>
+          <w:rFonts w:ascii="Times New Roman" w:hAnsi="Times New Roman" w:cs="Times New Roman"/>
+          <w:color w:val="4472C4" w:themeColor="accent1"/>
+          <w:lang w:val="en-US"/>
+        </w:rPr>
+        <w:t xml:space="preserve"> </w:t>
+      </w:r>
+      <w:r>
+        <w:rPr>
+          <w:rFonts w:ascii="Times New Roman" w:hAnsi="Times New Roman"/>
+          <w:color w:val="4472C4" w:themeColor="accent1"/>
+          <w:lang w:val="en-US"/>
+        </w:rPr>
+        <w:t xml:space="preserve">the </w:t>
+      </w:r>
+      <w:r>
+        <w:rPr>
+          <w:rFonts w:ascii="Times New Roman" w:hAnsi="Times New Roman" w:cs="Times New Roman"/>
+          <w:color w:val="4472C4" w:themeColor="accent1"/>
+          <w:lang w:val="en-US"/>
+        </w:rPr>
+        <w:t xml:space="preserve">most attempts </w:t>
+      </w:r>
+      <w:r>
+        <w:rPr>
+          <w:rFonts w:ascii="Times New Roman" w:hAnsi="Times New Roman" w:cs="Times New Roman"/>
+          <w:color w:val="4472C4" w:themeColor="accent1"/>
+          <w:lang w:val="en-US"/>
+        </w:rPr>
+        <w:t>of</w:t>
+      </w:r>
+      <w:r>
+        <w:rPr>
+          <w:rFonts w:ascii="Times New Roman" w:hAnsi="Times New Roman" w:cs="Times New Roman"/>
+          <w:color w:val="4472C4" w:themeColor="accent1"/>
+          <w:lang w:val="en-US"/>
+        </w:rPr>
+        <w:t xml:space="preserve"> brute-force by hackers.</w:t>
+      </w:r>
+    </w:p>
+    <w:p>
+      <w:pPr>
+        <w:spacing w:line="360" w:lineRule="auto"/>
+        <w:rPr>
+          <w:rFonts w:ascii="Times New Roman" w:hAnsi="Times New Roman" w:cs="Times New Roman"/>
+          <w:lang w:val="en-US"/>
+        </w:rPr>
+      </w:pPr>
+    </w:p>
+    <w:p>
+      <w:pPr>
+        <w:spacing w:line="360" w:lineRule="auto"/>
+        <w:rPr>
+          <w:rFonts w:ascii="Times New Roman" w:hAnsi="Times New Roman" w:cs="Times New Roman"/>
+          <w:lang w:val="en-US"/>
+        </w:rPr>
+      </w:pPr>
+      <w:r>
+        <w:rPr>
+          <w:rFonts w:ascii="Times New Roman" w:hAnsi="Times New Roman" w:cs="Times New Roman"/>
+          <w:lang w:val="en-US"/>
+        </w:rPr>
+        <w:drawing>
+          <wp:inline distT="0" distB="0" distL="0" distR="0" wp14:anchorId="6F337DFD" wp14:editId="44E2349F">
+            <wp:extent cx="2419815" cy="1399342"/>
+            <wp:effectExtent l="0" t="0" r="0" b="0"/>
+            <wp:docPr id="13" name="Picture 13"/>
+            <wp:cNvGraphicFramePr>
+              <a:graphicFrameLocks xmlns:a="http://schemas.openxmlformats.org/drawingml/2006/main" noChangeAspect="1"/>
+            </wp:cNvGraphicFramePr>
+            <a:graphic xmlns:a="http://schemas.openxmlformats.org/drawingml/2006/main">
+              <a:graphicData uri="http://schemas.openxmlformats.org/drawingml/2006/picture">
+                <pic:pic xmlns:pic="http://schemas.openxmlformats.org/drawingml/2006/picture">
+                  <pic:nvPicPr>
+                    <pic:cNvPr id="1" name=""/>
+                    <pic:cNvPicPr/>
+                  </pic:nvPicPr>
+                  <pic:blipFill rotWithShape="1">
+                    <a:blip r:embed="rId12"/>
+                    <a:srcRect l="21" r="79341"/>
+                    <a:stretch/>
+                  </pic:blipFill>
+                  <pic:spPr bwMode="auto">
+                    <a:xfrm>
+                      <a:off x="0" y="0"/>
+                      <a:ext cx="2461233" cy="1423294"/>
+                    </a:xfrm>
+                    <a:prstGeom prst="rect">
+                      <a:avLst/>
+                    </a:prstGeom>
+                    <a:ln>
+                      <a:noFill/>
+                    </a:ln>
+                    <a:extLst>
+                      <a:ext uri="{53640926-AAD7-44D8-BBD7-CCE9431645EC}">
+                        <a14:shadowObscured xmlns:a14="http://schemas.microsoft.com/office/drawing/2010/main"/>
+                      </a:ext>
+                    </a:extLst>
+                  </pic:spPr>
+                </pic:pic>
+              </a:graphicData>
+            </a:graphic>
+          </wp:inline>
+        </w:drawing>
+      </w:r>
+      <w:r>
+        <w:rPr>
+          <w:rFonts w:ascii="Times New Roman" w:hAnsi="Times New Roman" w:cs="Times New Roman"/>
+          <w:lang w:val="en-US"/>
+        </w:rPr>
+        <w:drawing>
+          <wp:inline distT="0" distB="0" distL="0" distR="0" wp14:anchorId="6EB36B57" wp14:editId="481B2E87">
+            <wp:extent cx="1565132" cy="1403985"/>
+            <wp:effectExtent l="0" t="0" r="0" b="5715"/>
+            <wp:docPr id="12" name="Picture 12"/>
+            <wp:cNvGraphicFramePr>
+              <a:graphicFrameLocks xmlns:a="http://schemas.openxmlformats.org/drawingml/2006/main" noChangeAspect="1"/>
+            </wp:cNvGraphicFramePr>
+            <a:graphic xmlns:a="http://schemas.openxmlformats.org/drawingml/2006/main">
+              <a:graphicData uri="http://schemas.openxmlformats.org/drawingml/2006/picture">
+                <pic:pic xmlns:pic="http://schemas.openxmlformats.org/drawingml/2006/picture">
+                  <pic:nvPicPr>
+                    <pic:cNvPr id="1" name=""/>
+                    <pic:cNvPicPr/>
+                  </pic:nvPicPr>
+                  <pic:blipFill rotWithShape="1">
+                    <a:blip r:embed="rId12"/>
+                    <a:srcRect l="86697"/>
+                    <a:stretch/>
+                  </pic:blipFill>
+                  <pic:spPr bwMode="auto">
+                    <a:xfrm>
+                      <a:off x="0" y="0"/>
+                      <a:ext cx="1586657" cy="1423294"/>
+                    </a:xfrm>
+                    <a:prstGeom prst="rect">
+                      <a:avLst/>
+                    </a:prstGeom>
+                    <a:ln>
+                      <a:noFill/>
+                    </a:ln>
+                    <a:extLst>
+                      <a:ext uri="{53640926-AAD7-44D8-BBD7-CCE9431645EC}">
+                        <a14:shadowObscured xmlns:a14="http://schemas.microsoft.com/office/drawing/2010/main"/>
+                      </a:ext>
+                    </a:extLst>
+                  </pic:spPr>
+                </pic:pic>
+              </a:graphicData>
+            </a:graphic>
+          </wp:inline>
+        </w:drawing>
+      </w:r>
+    </w:p>
+    <w:p>
+      <w:pPr>
+        <w:spacing w:line="360" w:lineRule="auto"/>
+        <w:rPr>
+          <w:rFonts w:ascii="Times New Roman" w:hAnsi="Times New Roman" w:cs="Times New Roman"/>
+        </w:rPr>
+      </w:pPr>
+    </w:p>
+    <w:p>
+      <w:pPr>
+        <w:rPr>
+          <w:rFonts w:ascii="Times New Roman" w:hAnsi="Times New Roman" w:cs="Times New Roman"/>
+        </w:rPr>
+      </w:pPr>
+      <w:r>
+        <w:rPr>
+          <w:rFonts w:ascii="Times New Roman" w:hAnsi="Times New Roman" w:cs="Times New Roman"/>
+        </w:rPr>
+        <w:br w:type="page"/>
+      </w:r>
+    </w:p>
+    <w:p>
+      <w:pPr>
+        <w:spacing w:line="360" w:lineRule="auto"/>
+        <w:rPr>
+          <w:rFonts w:ascii="Times New Roman" w:hAnsi="Times New Roman" w:cs="Times New Roman"/>
+        </w:rPr>
+      </w:pPr>
+      <w:r>
+        <w:rPr>
+          <w:rFonts w:ascii="Times New Roman" w:hAnsi="Times New Roman" w:cs="Times New Roman"/>
+        </w:rPr>
+        <w:lastRenderedPageBreak/>
+        <w:t>Q4. What is the most popular account that hackers use to try to break in?</w:t>
+      </w:r>
+    </w:p>
+    <w:p>
+      <w:pPr>
+        <w:pStyle w:val="ListParagraph"/>
+        <w:numPr>
+          <w:ilvl w:val="0"/>
+          <w:numId w:val="2"/>
+        </w:numPr>
+        <w:spacing w:line="360" w:lineRule="auto"/>
+        <w:rPr>
+          <w:rFonts w:ascii="Times New Roman" w:hAnsi="Times New Roman" w:cs="Times New Roman"/>
+          <w:color w:val="4472C4" w:themeColor="accent1"/>
+          <w:lang w:val="en-US"/>
+        </w:rPr>
+      </w:pPr>
+      <w:r>
+        <w:rPr>
+          <w:rFonts w:ascii="Times New Roman" w:hAnsi="Times New Roman" w:cs="Times New Roman"/>
+          <w:color w:val="4472C4" w:themeColor="accent1"/>
+          <w:lang w:val="en-US"/>
+        </w:rPr>
+        <w:t>‘</w:t>
+      </w:r>
+      <w:r>
+        <w:rPr>
+          <w:rFonts w:ascii="Times New Roman" w:hAnsi="Times New Roman" w:cs="Times New Roman"/>
+          <w:color w:val="4472C4" w:themeColor="accent1"/>
+          <w:lang w:val="en-US"/>
+        </w:rPr>
+        <w:t>root’</w:t>
+      </w:r>
+    </w:p>
+    <w:p>
+      <w:pPr>
+        <w:pStyle w:val="ListParagraph"/>
+        <w:spacing w:line="360" w:lineRule="auto"/>
+        <w:rPr>
+          <w:rFonts w:ascii="Times New Roman" w:hAnsi="Times New Roman" w:cs="Times New Roman"/>
+          <w:color w:val="4472C4" w:themeColor="accent1"/>
+          <w:lang w:val="en-US"/>
+        </w:rPr>
+      </w:pPr>
+      <w:r>
+        <w:rPr>
+          <w:rFonts w:ascii="Times New Roman" w:hAnsi="Times New Roman" w:cs="Times New Roman"/>
+          <w:color w:val="4472C4" w:themeColor="accent1"/>
+          <w:lang w:val="en-US"/>
+        </w:rPr>
+        <w:t>(The string “from” after username is added, because of my regex syntax to extract usernames from log files.)</w:t>
+      </w:r>
+    </w:p>
+    <w:p>
+      <w:pPr>
+        <w:spacing w:line="360" w:lineRule="auto"/>
+        <w:rPr>
+          <w:rFonts w:ascii="Times New Roman" w:hAnsi="Times New Roman" w:cs="Times New Roman"/>
+          <w:lang w:val="en-US"/>
+        </w:rPr>
+      </w:pPr>
+    </w:p>
+    <w:p>
+      <w:pPr>
+        <w:spacing w:line="360" w:lineRule="auto"/>
+        <w:rPr>
+          <w:rFonts w:ascii="Times New Roman" w:hAnsi="Times New Roman" w:cs="Times New Roman"/>
+          <w:cs/>
+          <w:lang w:val="en-US"/>
+        </w:rPr>
+      </w:pPr>
+      <w:r>
+        <w:rPr>
+          <w:rFonts w:ascii="Times New Roman" w:hAnsi="Times New Roman" w:cs="Times New Roman"/>
+          <w:lang w:val="en-US"/>
+        </w:rPr>
+        <w:drawing>
+          <wp:inline distT="0" distB="0" distL="0" distR="0" wp14:anchorId="52FAC8DE" wp14:editId="2AB8BEA5">
+            <wp:extent cx="5820937" cy="4794407"/>
+            <wp:effectExtent l="0" t="0" r="0" b="0"/>
+            <wp:docPr id="11" name="Picture 11"/>
+            <wp:cNvGraphicFramePr>
+              <a:graphicFrameLocks xmlns:a="http://schemas.openxmlformats.org/drawingml/2006/main" noChangeAspect="1"/>
+            </wp:cNvGraphicFramePr>
+            <a:graphic xmlns:a="http://schemas.openxmlformats.org/drawingml/2006/main">
+              <a:graphicData uri="http://schemas.openxmlformats.org/drawingml/2006/picture">
+                <pic:pic xmlns:pic="http://schemas.openxmlformats.org/drawingml/2006/picture">
+                  <pic:nvPicPr>
+                    <pic:cNvPr id="1" name=""/>
+                    <pic:cNvPicPr/>
+                  </pic:nvPicPr>
+                  <pic:blipFill rotWithShape="1">
+                    <a:blip r:embed="rId13"/>
+                    <a:srcRect l="938" r="1114" b="1355"/>
+                    <a:stretch/>
+                  </pic:blipFill>
+                  <pic:spPr bwMode="auto">
+                    <a:xfrm>
+                      <a:off x="0" y="0"/>
+                      <a:ext cx="5821686" cy="4795024"/>
+                    </a:xfrm>
+                    <a:prstGeom prst="rect">
+                      <a:avLst/>
+                    </a:prstGeom>
+                    <a:ln>
+                      <a:noFill/>
+                    </a:ln>
+                    <a:extLst>
+                      <a:ext uri="{53640926-AAD7-44D8-BBD7-CCE9431645EC}">
+                        <a14:shadowObscured xmlns:a14="http://schemas.microsoft.com/office/drawing/2010/main"/>
+                      </a:ext>
+                    </a:extLst>
+                  </pic:spPr>
+                </pic:pic>
+              </a:graphicData>
+            </a:graphic>
+          </wp:inline>
+        </w:drawing>
+      </w:r>
+    </w:p>
+    <w:p>
+      <w:pPr>
         <w:spacing w:line="360" w:lineRule="auto"/>
         <w:rPr>
           <w:rFonts w:ascii="Times New Roman" w:hAnsi="Times New Roman" w:cs="Times New Roman"/>
@@ -558,255 +1233,27 @@
           <w:rFonts w:ascii="Times New Roman" w:hAnsi="Times New Roman" w:cs="Times New Roman"/>
         </w:rPr>
       </w:pPr>
-      <w:hyperlink r:id="rId8" w:history="1">
+      <w:hyperlink r:id="rId14" w:history="1">
         <w:r>
           <w:rPr>
             <w:rStyle w:val="Hyperlink"/>
             <w:rFonts w:ascii="Times New Roman" w:hAnsi="Times New Roman" w:cs="Times New Roman"/>
           </w:rPr>
-          <w:t>https://zeltser.com/security-incident-log-review-checklist/</w:t>
+          <w:t>https://zeltser.com/security-</w:t>
         </w:r>
-      </w:hyperlink>
-    </w:p>
-    <w:p>
-      <w:pPr>
-        <w:spacing w:line="360" w:lineRule="auto"/>
-        <w:rPr>
-          <w:rFonts w:ascii="Times New Roman" w:hAnsi="Times New Roman" w:cs="Times New Roman"/>
-        </w:rPr>
-      </w:pPr>
-    </w:p>
-    <w:p>
-      <w:pPr>
-        <w:spacing w:line="360" w:lineRule="auto"/>
-        <w:rPr>
-          <w:rFonts w:ascii="Times New Roman" w:hAnsi="Times New Roman" w:cs="Times New Roman"/>
-        </w:rPr>
-      </w:pPr>
-      <w:r>
-        <w:rPr>
-          <w:rFonts w:ascii="Times New Roman" w:hAnsi="Times New Roman" w:cs="Times New Roman"/>
-        </w:rPr>
-        <w:t>Q5. Can you find attempts to get access to sensitive information from our web</w:t>
-      </w:r>
-    </w:p>
-    <w:p>
-      <w:pPr>
-        <w:spacing w:line="360" w:lineRule="auto"/>
-        <w:rPr>
-          <w:rFonts w:ascii="Times New Roman" w:hAnsi="Times New Roman" w:cs="Times New Roman"/>
-        </w:rPr>
-      </w:pPr>
-      <w:r>
-        <w:rPr>
-          <w:rFonts w:ascii="Times New Roman" w:hAnsi="Times New Roman" w:cs="Times New Roman"/>
-        </w:rPr>
-        <w:t>servers? How many attempts were there?</w:t>
-      </w:r>
-    </w:p>
-    <w:p>
-      <w:pPr>
-        <w:spacing w:line="360" w:lineRule="auto"/>
-        <w:rPr>
-          <w:rFonts w:ascii="Times New Roman" w:hAnsi="Times New Roman" w:cs="Times New Roman"/>
-        </w:rPr>
-      </w:pPr>
-      <w:r>
-        <w:rPr>
-          <w:rFonts w:ascii="Times New Roman" w:hAnsi="Times New Roman" w:cs="Times New Roman"/>
-        </w:rPr>
-        <w:t>Q6. What resource/file are hackers looking for?</w:t>
-      </w:r>
-    </w:p>
-    <w:p>
-      <w:pPr>
-        <w:spacing w:line="360" w:lineRule="auto"/>
-        <w:rPr>
-          <w:rFonts w:ascii="Times New Roman" w:hAnsi="Times New Roman" w:cs="Times New Roman"/>
-        </w:rPr>
-      </w:pPr>
-    </w:p>
-    <w:p>
-      <w:pPr>
-        <w:spacing w:line="360" w:lineRule="auto"/>
-        <w:rPr>
-          <w:rFonts w:ascii="Times New Roman" w:hAnsi="Times New Roman" w:cs="Times New Roman"/>
-          <w:sz w:val="32"/>
-          <w:szCs w:val="36"/>
-        </w:rPr>
-      </w:pPr>
-      <w:r>
-        <w:rPr>
-          <w:rFonts w:ascii="Times New Roman" w:hAnsi="Times New Roman" w:cs="Times New Roman"/>
-          <w:sz w:val="32"/>
-          <w:szCs w:val="36"/>
-        </w:rPr>
-        <w:br w:type="page"/>
-      </w:r>
-    </w:p>
-    <w:p>
-      <w:pPr>
-        <w:spacing w:line="360" w:lineRule="auto"/>
-        <w:rPr>
-          <w:rFonts w:ascii="Times New Roman" w:hAnsi="Times New Roman" w:cs="Times New Roman"/>
-          <w:sz w:val="32"/>
-          <w:szCs w:val="36"/>
-        </w:rPr>
-      </w:pPr>
-      <w:r>
-        <w:rPr>
-          <w:rFonts w:ascii="Times New Roman" w:hAnsi="Times New Roman" w:cs="Times New Roman"/>
-          <w:sz w:val="32"/>
-          <w:szCs w:val="36"/>
-        </w:rPr>
-        <w:lastRenderedPageBreak/>
-        <w:t>Part III. Are there bots crawling our websites?</w:t>
-      </w:r>
-    </w:p>
-    <w:p>
-      <w:pPr>
-        <w:spacing w:line="360" w:lineRule="auto"/>
-        <w:rPr>
-          <w:rFonts w:ascii="Times New Roman" w:hAnsi="Times New Roman" w:cs="Times New Roman"/>
-        </w:rPr>
-      </w:pPr>
-    </w:p>
-    <w:p>
-      <w:pPr>
-        <w:spacing w:line="360" w:lineRule="auto"/>
-        <w:rPr>
-          <w:rFonts w:ascii="Times New Roman" w:hAnsi="Times New Roman" w:cs="Times New Roman"/>
-        </w:rPr>
-      </w:pPr>
-      <w:r>
-        <w:rPr>
-          <w:rFonts w:ascii="Times New Roman" w:hAnsi="Times New Roman" w:cs="Times New Roman"/>
-        </w:rPr>
-        <w:t>Q7. Can you find any bots crawling our websites?</w:t>
-      </w:r>
-    </w:p>
-    <w:p>
-      <w:pPr>
-        <w:spacing w:line="360" w:lineRule="auto"/>
-        <w:rPr>
-          <w:rFonts w:ascii="Times New Roman" w:hAnsi="Times New Roman" w:cs="Times New Roman"/>
-        </w:rPr>
-      </w:pPr>
-      <w:r>
-        <w:rPr>
-          <w:rFonts w:ascii="Times New Roman" w:hAnsi="Times New Roman" w:cs="Times New Roman"/>
-        </w:rPr>
-        <w:t>Q8. What are they doing on the site? (Hint: Look for User-Agent in the web</w:t>
-      </w:r>
-    </w:p>
-    <w:p>
-      <w:pPr>
-        <w:spacing w:line="360" w:lineRule="auto"/>
-        <w:rPr>
-          <w:rFonts w:ascii="Times New Roman" w:hAnsi="Times New Roman" w:cs="Times New Roman"/>
-        </w:rPr>
-      </w:pPr>
-      <w:r>
-        <w:rPr>
-          <w:rFonts w:ascii="Times New Roman" w:hAnsi="Times New Roman" w:cs="Times New Roman"/>
-        </w:rPr>
-        <w:t>access.logs.)</w:t>
-      </w:r>
-    </w:p>
-    <w:p>
-      <w:pPr>
-        <w:spacing w:line="360" w:lineRule="auto"/>
-        <w:rPr>
-          <w:rFonts w:ascii="Times New Roman" w:hAnsi="Times New Roman" w:cs="Times New Roman"/>
-        </w:rPr>
-      </w:pPr>
-    </w:p>
-    <w:p>
-      <w:pPr>
-        <w:spacing w:line="360" w:lineRule="auto"/>
-        <w:rPr>
-          <w:rFonts w:ascii="Times New Roman" w:hAnsi="Times New Roman" w:cs="Times New Roman"/>
-        </w:rPr>
-      </w:pPr>
-      <w:r>
-        <w:rPr>
-          <w:rFonts w:ascii="Times New Roman" w:hAnsi="Times New Roman" w:cs="Times New Roman"/>
-        </w:rPr>
-        <w:t>Cleaning up</w:t>
-      </w:r>
-    </w:p>
-    <w:p>
-      <w:pPr>
-        <w:spacing w:line="360" w:lineRule="auto"/>
-        <w:rPr>
-          <w:rFonts w:ascii="Times New Roman" w:hAnsi="Times New Roman" w:cs="Times New Roman"/>
-        </w:rPr>
-      </w:pPr>
-    </w:p>
-    <w:p>
-      <w:pPr>
-        <w:spacing w:line="360" w:lineRule="auto"/>
-        <w:rPr>
-          <w:rFonts w:ascii="Times New Roman" w:hAnsi="Times New Roman" w:cs="Times New Roman"/>
-        </w:rPr>
-      </w:pPr>
-      <w:r>
-        <w:rPr>
-          <w:rFonts w:ascii="Times New Roman" w:hAnsi="Times New Roman" w:cs="Times New Roman"/>
-        </w:rPr>
-        <w:t>Shut down splunk on your notebook (otherwise, it will keep running in the</w:t>
-      </w:r>
-    </w:p>
-    <w:p>
-      <w:pPr>
-        <w:spacing w:line="360" w:lineRule="auto"/>
-        <w:rPr>
-          <w:rFonts w:ascii="Times New Roman" w:hAnsi="Times New Roman" w:cs="Times New Roman"/>
-        </w:rPr>
-      </w:pPr>
-      <w:r>
-        <w:rPr>
-          <w:rFonts w:ascii="Times New Roman" w:hAnsi="Times New Roman" w:cs="Times New Roman"/>
-        </w:rPr>
-        <w:t>background). Mac users should follow Unix instructions. The splunk command is</w:t>
-      </w:r>
-    </w:p>
-    <w:p>
-      <w:pPr>
-        <w:spacing w:line="360" w:lineRule="auto"/>
-        <w:rPr>
-          <w:rFonts w:ascii="Times New Roman" w:hAnsi="Times New Roman" w:cs="Times New Roman"/>
-        </w:rPr>
-      </w:pPr>
-      <w:r>
-        <w:rPr>
-          <w:rFonts w:ascii="Times New Roman" w:hAnsi="Times New Roman" w:cs="Times New Roman"/>
-        </w:rPr>
-        <w:t>located at /Applications/Splunk/bin/.</w:t>
-      </w:r>
-    </w:p>
-    <w:p>
-      <w:pPr>
-        <w:spacing w:line="360" w:lineRule="auto"/>
-        <w:rPr>
-          <w:rFonts w:ascii="Times New Roman" w:hAnsi="Times New Roman" w:cs="Times New Roman"/>
-        </w:rPr>
-      </w:pPr>
-    </w:p>
-    <w:p>
-      <w:pPr>
-        <w:spacing w:line="360" w:lineRule="auto"/>
-        <w:rPr>
-          <w:rFonts w:ascii="Times New Roman" w:hAnsi="Times New Roman" w:cs="Times New Roman"/>
-        </w:rPr>
-      </w:pPr>
-      <w:hyperlink r:id="rId9" w:history="1">
         <w:r>
           <w:rPr>
             <w:rStyle w:val="Hyperlink"/>
             <w:rFonts w:ascii="Times New Roman" w:hAnsi="Times New Roman" w:cs="Times New Roman"/>
           </w:rPr>
-          <w:t>http://docs.splunk.com/Documentation/Splunk/latest/Admin/StartSplunk</w:t>
+          <w:t>i</w:t>
+        </w:r>
+        <w:r>
+          <w:rPr>
+            <w:rStyle w:val="Hyperlink"/>
+            <w:rFonts w:ascii="Times New Roman" w:hAnsi="Times New Roman" w:cs="Times New Roman"/>
+          </w:rPr>
+          <w:t>ncident-log-review-checklist/</w:t>
         </w:r>
       </w:hyperlink>
     </w:p>
@@ -817,6 +1264,763 @@
           <w:rFonts w:ascii="Times New Roman" w:hAnsi="Times New Roman" w:cs="Times New Roman"/>
         </w:rPr>
       </w:pPr>
+    </w:p>
+    <w:p>
+      <w:pPr>
+        <w:spacing w:line="360" w:lineRule="auto"/>
+        <w:rPr>
+          <w:rFonts w:ascii="Times New Roman" w:hAnsi="Times New Roman" w:cs="Times New Roman"/>
+        </w:rPr>
+      </w:pPr>
+      <w:r>
+        <w:rPr>
+          <w:rFonts w:ascii="Times New Roman" w:hAnsi="Times New Roman" w:cs="Times New Roman"/>
+        </w:rPr>
+        <w:t>Q5. Can you find attempts to get access to sensitive information from our web</w:t>
+      </w:r>
+      <w:r>
+        <w:rPr>
+          <w:rFonts w:ascii="Times New Roman" w:hAnsi="Times New Roman" w:cs="Times New Roman"/>
+          <w:lang w:val="en-US"/>
+        </w:rPr>
+        <w:t xml:space="preserve"> </w:t>
+      </w:r>
+      <w:r>
+        <w:rPr>
+          <w:rFonts w:ascii="Times New Roman" w:hAnsi="Times New Roman" w:cs="Times New Roman"/>
+        </w:rPr>
+        <w:t>servers?</w:t>
+      </w:r>
+      <w:r>
+        <w:rPr>
+          <w:rFonts w:ascii="Times New Roman" w:hAnsi="Times New Roman" w:cs="Times New Roman"/>
+        </w:rPr>
+        <w:br/>
+      </w:r>
+      <w:r>
+        <w:rPr>
+          <w:rFonts w:ascii="Times New Roman" w:hAnsi="Times New Roman" w:cs="Times New Roman"/>
+        </w:rPr>
+        <w:t>How many attempts were there?</w:t>
+      </w:r>
+    </w:p>
+    <w:p>
+      <w:pPr>
+        <w:pStyle w:val="ListParagraph"/>
+        <w:numPr>
+          <w:ilvl w:val="0"/>
+          <w:numId w:val="2"/>
+        </w:numPr>
+        <w:spacing w:line="360" w:lineRule="auto"/>
+        <w:rPr>
+          <w:rFonts w:ascii="Times New Roman" w:hAnsi="Times New Roman" w:cs="Times New Roman"/>
+          <w:color w:val="4472C4" w:themeColor="accent1"/>
+          <w:lang w:val="en-US"/>
+        </w:rPr>
+      </w:pPr>
+      <w:r>
+        <w:rPr>
+          <w:rFonts w:ascii="Times New Roman" w:hAnsi="Times New Roman" w:cs="Times New Roman"/>
+          <w:color w:val="4472C4" w:themeColor="accent1"/>
+          <w:lang w:val="en-US"/>
+        </w:rPr>
+        <w:t xml:space="preserve">I considered </w:t>
+      </w:r>
+      <w:r>
+        <w:rPr>
+          <w:rFonts w:ascii="Times New Roman" w:hAnsi="Times New Roman" w:cs="Times New Roman"/>
+          <w:color w:val="4472C4" w:themeColor="accent1"/>
+          <w:lang w:val="en-US"/>
+        </w:rPr>
+        <w:t xml:space="preserve">only </w:t>
+      </w:r>
+      <w:r>
+        <w:rPr>
+          <w:rFonts w:ascii="Times New Roman" w:hAnsi="Times New Roman" w:cs="Times New Roman"/>
+          <w:color w:val="4472C4" w:themeColor="accent1"/>
+          <w:lang w:val="en-US"/>
+        </w:rPr>
+        <w:t>log</w:t>
+      </w:r>
+      <w:r>
+        <w:rPr>
+          <w:rFonts w:ascii="Times New Roman" w:hAnsi="Times New Roman" w:cs="Times New Roman"/>
+          <w:color w:val="4472C4" w:themeColor="accent1"/>
+          <w:lang w:val="en-US"/>
+        </w:rPr>
+        <w:t xml:space="preserve"> messages</w:t>
+      </w:r>
+      <w:r>
+        <w:rPr>
+          <w:rFonts w:ascii="Times New Roman" w:hAnsi="Times New Roman" w:cs="Times New Roman"/>
+          <w:color w:val="4472C4" w:themeColor="accent1"/>
+          <w:lang w:val="en-US"/>
+        </w:rPr>
+        <w:t xml:space="preserve"> with </w:t>
+      </w:r>
+      <w:r>
+        <w:rPr>
+          <w:rFonts w:ascii="Times New Roman" w:hAnsi="Times New Roman" w:cs="Times New Roman"/>
+          <w:color w:val="4472C4" w:themeColor="accent1"/>
+          <w:lang w:val="en-US"/>
+        </w:rPr>
+        <w:t xml:space="preserve">specific </w:t>
+      </w:r>
+      <w:r>
+        <w:rPr>
+          <w:rFonts w:ascii="Times New Roman" w:hAnsi="Times New Roman" w:cs="Times New Roman"/>
+          <w:color w:val="4472C4" w:themeColor="accent1"/>
+          <w:lang w:val="en-US"/>
+        </w:rPr>
+        <w:t>status code</w:t>
+      </w:r>
+      <w:r>
+        <w:rPr>
+          <w:rFonts w:ascii="Times New Roman" w:hAnsi="Times New Roman" w:cs="Times New Roman"/>
+          <w:color w:val="4472C4" w:themeColor="accent1"/>
+          <w:lang w:val="en-US"/>
+        </w:rPr>
+        <w:t>s which</w:t>
+      </w:r>
+      <w:r>
+        <w:rPr>
+          <w:rFonts w:ascii="Times New Roman" w:hAnsi="Times New Roman" w:cs="Times New Roman"/>
+          <w:color w:val="4472C4" w:themeColor="accent1"/>
+          <w:lang w:val="en-US"/>
+        </w:rPr>
+        <w:t xml:space="preserve"> are 400</w:t>
+      </w:r>
+      <w:r>
+        <w:rPr>
+          <w:rFonts w:ascii="Times New Roman" w:hAnsi="Times New Roman" w:cs="Times New Roman"/>
+          <w:color w:val="4472C4" w:themeColor="accent1"/>
+          <w:lang w:val="en-US"/>
+        </w:rPr>
+        <w:t xml:space="preserve">, 403, and 500 from </w:t>
+      </w:r>
+      <w:r>
+        <w:rPr>
+          <w:rFonts w:ascii="Times New Roman" w:hAnsi="Times New Roman" w:cs="Times New Roman"/>
+          <w:color w:val="4472C4" w:themeColor="accent1"/>
+          <w:lang w:val="en-US"/>
+        </w:rPr>
+        <w:t>recommended review checklist.</w:t>
+      </w:r>
+      <w:r>
+        <w:rPr>
+          <w:rFonts w:ascii="Times New Roman" w:hAnsi="Times New Roman" w:cs="Times New Roman"/>
+          <w:color w:val="4472C4" w:themeColor="accent1"/>
+          <w:lang w:val="en-US"/>
+        </w:rPr>
+        <w:br/>
+      </w:r>
+      <w:r>
+        <w:rPr>
+          <w:rFonts w:ascii="Times New Roman" w:hAnsi="Times New Roman" w:cs="Times New Roman"/>
+          <w:color w:val="4472C4" w:themeColor="accent1"/>
+          <w:lang w:val="en-US"/>
+        </w:rPr>
+        <w:t>Then, I got the number of suspicious events (from hackers) was 1,662.</w:t>
+      </w:r>
+    </w:p>
+    <w:p>
+      <w:pPr>
+        <w:spacing w:line="360" w:lineRule="auto"/>
+        <w:rPr>
+          <w:rFonts w:ascii="Times New Roman" w:hAnsi="Times New Roman" w:cs="Times New Roman"/>
+          <w:lang w:val="en-US"/>
+        </w:rPr>
+      </w:pPr>
+    </w:p>
+    <w:p>
+      <w:pPr>
+        <w:spacing w:line="360" w:lineRule="auto"/>
+        <w:rPr>
+          <w:rFonts w:ascii="Times New Roman" w:hAnsi="Times New Roman" w:cs="Times New Roman"/>
+          <w:lang w:val="en-US"/>
+        </w:rPr>
+      </w:pPr>
+      <w:r>
+        <w:rPr>
+          <w:rFonts w:ascii="Times New Roman" w:hAnsi="Times New Roman" w:cs="Times New Roman"/>
+          <w:lang w:val="en-US"/>
+        </w:rPr>
+        <w:drawing>
+          <wp:inline distT="0" distB="0" distL="0" distR="0" wp14:anchorId="353BCFC9" wp14:editId="11E7CCA7">
+            <wp:extent cx="6116140" cy="2720898"/>
+            <wp:effectExtent l="0" t="0" r="0" b="0"/>
+            <wp:docPr id="18" name="Picture 18" descr="Graphical user interface, application&#10;&#10;Description automatically generated"/>
+            <wp:cNvGraphicFramePr>
+              <a:graphicFrameLocks xmlns:a="http://schemas.openxmlformats.org/drawingml/2006/main" noChangeAspect="1"/>
+            </wp:cNvGraphicFramePr>
+            <a:graphic xmlns:a="http://schemas.openxmlformats.org/drawingml/2006/main">
+              <a:graphicData uri="http://schemas.openxmlformats.org/drawingml/2006/picture">
+                <pic:pic xmlns:pic="http://schemas.openxmlformats.org/drawingml/2006/picture">
+                  <pic:nvPicPr>
+                    <pic:cNvPr id="18" name="Picture 18" descr="Graphical user interface, application&#10;&#10;Description automatically generated"/>
+                    <pic:cNvPicPr/>
+                  </pic:nvPicPr>
+                  <pic:blipFill>
+                    <a:blip r:embed="rId15"/>
+                    <a:stretch>
+                      <a:fillRect/>
+                    </a:stretch>
+                  </pic:blipFill>
+                  <pic:spPr>
+                    <a:xfrm>
+                      <a:off x="0" y="0"/>
+                      <a:ext cx="6123031" cy="2723964"/>
+                    </a:xfrm>
+                    <a:prstGeom prst="rect">
+                      <a:avLst/>
+                    </a:prstGeom>
+                  </pic:spPr>
+                </pic:pic>
+              </a:graphicData>
+            </a:graphic>
+          </wp:inline>
+        </w:drawing>
+      </w:r>
+    </w:p>
+    <w:p>
+      <w:pPr>
+        <w:spacing w:line="360" w:lineRule="auto"/>
+        <w:rPr>
+          <w:rFonts w:ascii="Times New Roman" w:hAnsi="Times New Roman" w:cs="Times New Roman" w:hint="cs"/>
+          <w:cs/>
+          <w:lang w:val="en-US"/>
+        </w:rPr>
+      </w:pPr>
+    </w:p>
+    <w:p>
+      <w:pPr>
+        <w:spacing w:line="360" w:lineRule="auto"/>
+        <w:rPr>
+          <w:rFonts w:ascii="Times New Roman" w:hAnsi="Times New Roman" w:cs="Times New Roman"/>
+        </w:rPr>
+      </w:pPr>
+      <w:r>
+        <w:rPr>
+          <w:rFonts w:ascii="Times New Roman" w:hAnsi="Times New Roman" w:cs="Times New Roman"/>
+        </w:rPr>
+        <w:br/>
+      </w:r>
+    </w:p>
+    <w:p>
+      <w:pPr>
+        <w:rPr>
+          <w:rFonts w:ascii="Times New Roman" w:hAnsi="Times New Roman" w:cs="Times New Roman"/>
+        </w:rPr>
+      </w:pPr>
+      <w:r>
+        <w:rPr>
+          <w:rFonts w:ascii="Times New Roman" w:hAnsi="Times New Roman" w:cs="Times New Roman"/>
+        </w:rPr>
+        <w:br w:type="page"/>
+      </w:r>
+    </w:p>
+    <w:p>
+      <w:pPr>
+        <w:spacing w:line="360" w:lineRule="auto"/>
+        <w:rPr>
+          <w:rFonts w:ascii="Times New Roman" w:hAnsi="Times New Roman" w:cs="Times New Roman"/>
+        </w:rPr>
+      </w:pPr>
+      <w:r>
+        <w:rPr>
+          <w:rFonts w:ascii="Times New Roman" w:hAnsi="Times New Roman" w:cs="Times New Roman"/>
+        </w:rPr>
+        <w:lastRenderedPageBreak/>
+        <w:t>Q6. What resource/file are hackers looking for?</w:t>
+      </w:r>
+    </w:p>
+    <w:p>
+      <w:pPr>
+        <w:pStyle w:val="ListParagraph"/>
+        <w:numPr>
+          <w:ilvl w:val="0"/>
+          <w:numId w:val="2"/>
+        </w:numPr>
+        <w:spacing w:line="360" w:lineRule="auto"/>
+        <w:rPr>
+          <w:rFonts w:ascii="Times New Roman" w:hAnsi="Times New Roman" w:cs="Times New Roman"/>
+          <w:color w:val="4472C4" w:themeColor="accent1"/>
+          <w:lang w:val="en-US"/>
+        </w:rPr>
+      </w:pPr>
+      <w:r>
+        <w:rPr>
+          <w:rFonts w:ascii="Times New Roman" w:hAnsi="Times New Roman"/>
+          <w:color w:val="4472C4" w:themeColor="accent1"/>
+          <w:lang w:val="en-US"/>
+        </w:rPr>
+        <w:t>After the log messages were</w:t>
+      </w:r>
+      <w:r>
+        <w:rPr>
+          <w:rFonts w:ascii="Times New Roman" w:hAnsi="Times New Roman"/>
+          <w:color w:val="4472C4" w:themeColor="accent1"/>
+          <w:lang w:val="en-US"/>
+        </w:rPr>
+        <w:t xml:space="preserve"> filtered </w:t>
+      </w:r>
+      <w:r>
+        <w:rPr>
+          <w:rFonts w:ascii="Times New Roman" w:hAnsi="Times New Roman"/>
+          <w:color w:val="4472C4" w:themeColor="accent1"/>
+          <w:lang w:val="en-US"/>
+        </w:rPr>
+        <w:t>with</w:t>
+      </w:r>
+      <w:r>
+        <w:rPr>
+          <w:rFonts w:ascii="Times New Roman" w:hAnsi="Times New Roman"/>
+          <w:color w:val="4472C4" w:themeColor="accent1"/>
+          <w:lang w:val="en-US"/>
+        </w:rPr>
+        <w:t xml:space="preserve"> </w:t>
+      </w:r>
+      <w:r>
+        <w:rPr>
+          <w:rFonts w:ascii="Times New Roman" w:hAnsi="Times New Roman"/>
+          <w:color w:val="4472C4" w:themeColor="accent1"/>
+          <w:lang w:val="en-US"/>
+        </w:rPr>
+        <w:t xml:space="preserve">those status code, the </w:t>
+      </w:r>
+      <w:r>
+        <w:rPr>
+          <w:rFonts w:ascii="Times New Roman" w:hAnsi="Times New Roman"/>
+          <w:color w:val="4472C4" w:themeColor="accent1"/>
+          <w:lang w:val="en-US"/>
+        </w:rPr>
+        <w:t>files</w:t>
+      </w:r>
+      <w:r>
+        <w:rPr>
+          <w:rFonts w:ascii="Times New Roman" w:hAnsi="Times New Roman"/>
+          <w:color w:val="4472C4" w:themeColor="accent1"/>
+          <w:lang w:val="en-US"/>
+        </w:rPr>
+        <w:t>,</w:t>
+      </w:r>
+      <w:r>
+        <w:rPr>
+          <w:rFonts w:ascii="Times New Roman" w:hAnsi="Times New Roman"/>
+          <w:color w:val="4472C4" w:themeColor="accent1"/>
+          <w:lang w:val="en-US"/>
+        </w:rPr>
+        <w:t xml:space="preserve"> attempted to reach by the hackers</w:t>
+      </w:r>
+      <w:r>
+        <w:rPr>
+          <w:rFonts w:ascii="Times New Roman" w:hAnsi="Times New Roman"/>
+          <w:color w:val="4472C4" w:themeColor="accent1"/>
+          <w:lang w:val="en-US"/>
+        </w:rPr>
+        <w:t>,</w:t>
+      </w:r>
+      <w:r>
+        <w:rPr>
+          <w:rFonts w:ascii="Times New Roman" w:hAnsi="Times New Roman"/>
+          <w:color w:val="4472C4" w:themeColor="accent1"/>
+          <w:lang w:val="en-US"/>
+        </w:rPr>
+        <w:t xml:space="preserve"> were </w:t>
+      </w:r>
+      <w:proofErr w:type="gramStart"/>
+      <w:r>
+        <w:rPr>
+          <w:rFonts w:ascii="Times New Roman" w:hAnsi="Times New Roman"/>
+          <w:color w:val="4472C4" w:themeColor="accent1"/>
+          <w:lang w:val="en-US"/>
+        </w:rPr>
+        <w:t>product.screen</w:t>
+      </w:r>
+      <w:proofErr w:type="gramEnd"/>
+      <w:r>
+        <w:rPr>
+          <w:rFonts w:ascii="Times New Roman" w:hAnsi="Times New Roman"/>
+          <w:color w:val="4472C4" w:themeColor="accent1"/>
+          <w:lang w:val="en-US"/>
+        </w:rPr>
+        <w:t xml:space="preserve">, </w:t>
+      </w:r>
+      <w:r>
+        <w:rPr>
+          <w:rFonts w:ascii="Times New Roman" w:hAnsi="Times New Roman"/>
+          <w:color w:val="4472C4" w:themeColor="accent1"/>
+          <w:lang w:val="en-US"/>
+        </w:rPr>
+        <w:t>cart.do,</w:t>
+      </w:r>
+      <w:r>
+        <w:rPr>
+          <w:rFonts w:ascii="Times New Roman" w:hAnsi="Times New Roman"/>
+          <w:color w:val="4472C4" w:themeColor="accent1"/>
+          <w:lang w:val="en-US"/>
+        </w:rPr>
+        <w:t xml:space="preserve"> </w:t>
+      </w:r>
+      <w:r>
+        <w:rPr>
+          <w:rFonts w:ascii="Times New Roman" w:hAnsi="Times New Roman"/>
+          <w:color w:val="4472C4" w:themeColor="accent1"/>
+          <w:lang w:val="en-US"/>
+        </w:rPr>
+        <w:t>oldlink, and</w:t>
+      </w:r>
+      <w:r>
+        <w:rPr>
+          <w:rFonts w:ascii="Times New Roman" w:hAnsi="Times New Roman"/>
+          <w:color w:val="4472C4" w:themeColor="accent1"/>
+          <w:lang w:val="en-US"/>
+        </w:rPr>
+        <w:t xml:space="preserve"> </w:t>
+      </w:r>
+      <w:r>
+        <w:rPr>
+          <w:rFonts w:ascii="Times New Roman" w:hAnsi="Times New Roman"/>
+          <w:color w:val="4472C4" w:themeColor="accent1"/>
+          <w:lang w:val="en-US"/>
+        </w:rPr>
+        <w:t>category</w:t>
+      </w:r>
+      <w:r>
+        <w:rPr>
+          <w:rFonts w:ascii="Times New Roman" w:hAnsi="Times New Roman"/>
+          <w:color w:val="4472C4" w:themeColor="accent1"/>
+          <w:lang w:val="en-US"/>
+        </w:rPr>
+        <w:t>.screen.</w:t>
+      </w:r>
+    </w:p>
+    <w:p>
+      <w:pPr>
+        <w:spacing w:line="360" w:lineRule="auto"/>
+        <w:rPr>
+          <w:rFonts w:ascii="Times New Roman" w:hAnsi="Times New Roman" w:cs="Times New Roman"/>
+          <w:lang w:val="en-US"/>
+        </w:rPr>
+      </w:pPr>
+    </w:p>
+    <w:p>
+      <w:pPr>
+        <w:spacing w:line="360" w:lineRule="auto"/>
+        <w:rPr>
+          <w:rFonts w:ascii="Times New Roman" w:hAnsi="Times New Roman" w:cs="Times New Roman" w:hint="cs"/>
+          <w:lang w:val="en-US"/>
+        </w:rPr>
+      </w:pPr>
+      <w:r>
+        <w:rPr>
+          <w:rFonts w:ascii="Times New Roman" w:hAnsi="Times New Roman" w:cs="Times New Roman"/>
+          <w:lang w:val="en-US"/>
+        </w:rPr>
+        <w:drawing>
+          <wp:inline distT="0" distB="0" distL="0" distR="0" wp14:anchorId="5C99E3E6" wp14:editId="5E2FA9FA">
+            <wp:extent cx="5943600" cy="3270250"/>
+            <wp:effectExtent l="0" t="0" r="0" b="6350"/>
+            <wp:docPr id="22" name="Picture 22" descr="Table&#10;&#10;Description automatically generated"/>
+            <wp:cNvGraphicFramePr>
+              <a:graphicFrameLocks xmlns:a="http://schemas.openxmlformats.org/drawingml/2006/main" noChangeAspect="1"/>
+            </wp:cNvGraphicFramePr>
+            <a:graphic xmlns:a="http://schemas.openxmlformats.org/drawingml/2006/main">
+              <a:graphicData uri="http://schemas.openxmlformats.org/drawingml/2006/picture">
+                <pic:pic xmlns:pic="http://schemas.openxmlformats.org/drawingml/2006/picture">
+                  <pic:nvPicPr>
+                    <pic:cNvPr id="22" name="Picture 22" descr="Table&#10;&#10;Description automatically generated"/>
+                    <pic:cNvPicPr/>
+                  </pic:nvPicPr>
+                  <pic:blipFill>
+                    <a:blip r:embed="rId16"/>
+                    <a:stretch>
+                      <a:fillRect/>
+                    </a:stretch>
+                  </pic:blipFill>
+                  <pic:spPr>
+                    <a:xfrm>
+                      <a:off x="0" y="0"/>
+                      <a:ext cx="5943600" cy="3270250"/>
+                    </a:xfrm>
+                    <a:prstGeom prst="rect">
+                      <a:avLst/>
+                    </a:prstGeom>
+                  </pic:spPr>
+                </pic:pic>
+              </a:graphicData>
+            </a:graphic>
+          </wp:inline>
+        </w:drawing>
+      </w:r>
+    </w:p>
+    <w:p>
+      <w:pPr>
+        <w:spacing w:line="360" w:lineRule="auto"/>
+        <w:rPr>
+          <w:rFonts w:ascii="Times New Roman" w:hAnsi="Times New Roman" w:cs="Times New Roman"/>
+          <w:sz w:val="32"/>
+          <w:szCs w:val="36"/>
+        </w:rPr>
+      </w:pPr>
+      <w:r>
+        <w:rPr>
+          <w:rFonts w:ascii="Times New Roman" w:hAnsi="Times New Roman" w:cs="Times New Roman"/>
+          <w:sz w:val="32"/>
+          <w:szCs w:val="36"/>
+        </w:rPr>
+        <w:br w:type="page"/>
+      </w:r>
+    </w:p>
+    <w:p>
+      <w:pPr>
+        <w:spacing w:line="360" w:lineRule="auto"/>
+        <w:rPr>
+          <w:rFonts w:ascii="Times New Roman" w:hAnsi="Times New Roman" w:cs="Times New Roman"/>
+          <w:sz w:val="32"/>
+          <w:szCs w:val="36"/>
+        </w:rPr>
+      </w:pPr>
+      <w:r>
+        <w:rPr>
+          <w:rFonts w:ascii="Times New Roman" w:hAnsi="Times New Roman" w:cs="Times New Roman"/>
+          <w:sz w:val="32"/>
+          <w:szCs w:val="36"/>
+        </w:rPr>
+        <w:lastRenderedPageBreak/>
+        <w:t>Part III. Are there bots crawling our websites?</w:t>
+      </w:r>
+    </w:p>
+    <w:p>
+      <w:pPr>
+        <w:spacing w:line="360" w:lineRule="auto"/>
+        <w:rPr>
+          <w:rFonts w:ascii="Times New Roman" w:hAnsi="Times New Roman" w:cs="Times New Roman"/>
+        </w:rPr>
+      </w:pPr>
+    </w:p>
+    <w:p>
+      <w:pPr>
+        <w:spacing w:line="360" w:lineRule="auto"/>
+        <w:rPr>
+          <w:rFonts w:ascii="Times New Roman" w:hAnsi="Times New Roman" w:cs="Times New Roman"/>
+        </w:rPr>
+      </w:pPr>
+      <w:r>
+        <w:rPr>
+          <w:rFonts w:ascii="Times New Roman" w:hAnsi="Times New Roman" w:cs="Times New Roman"/>
+        </w:rPr>
+        <w:t>Q7. Can you find any bots crawling our websites?</w:t>
+      </w:r>
+    </w:p>
+    <w:p>
+      <w:pPr>
+        <w:pStyle w:val="ListParagraph"/>
+        <w:numPr>
+          <w:ilvl w:val="0"/>
+          <w:numId w:val="2"/>
+        </w:numPr>
+        <w:spacing w:line="360" w:lineRule="auto"/>
+        <w:rPr>
+          <w:rFonts w:ascii="Times New Roman" w:hAnsi="Times New Roman" w:cs="Times New Roman"/>
+          <w:color w:val="4472C4" w:themeColor="accent1"/>
+          <w:lang w:val="en-US"/>
+        </w:rPr>
+      </w:pPr>
+      <w:r>
+        <w:rPr>
+          <w:rFonts w:ascii="Times New Roman" w:hAnsi="Times New Roman" w:cs="Times New Roman"/>
+          <w:color w:val="4472C4" w:themeColor="accent1"/>
+          <w:lang w:val="en-US"/>
+        </w:rPr>
+        <w:t>I found 4 bots by filtering User-Agent with words of ‘bot’, and ‘bots</w:t>
+      </w:r>
+      <w:r>
+        <w:rPr>
+          <w:rFonts w:ascii="Times New Roman" w:hAnsi="Times New Roman" w:cs="Times New Roman"/>
+          <w:color w:val="4472C4" w:themeColor="accent1"/>
+          <w:lang w:val="en-US"/>
+        </w:rPr>
+        <w:t>.</w:t>
+      </w:r>
+      <w:r>
+        <w:rPr>
+          <w:rFonts w:ascii="Times New Roman" w:hAnsi="Times New Roman" w:cs="Times New Roman"/>
+          <w:color w:val="4472C4" w:themeColor="accent1"/>
+          <w:lang w:val="en-US"/>
+        </w:rPr>
+        <w:t>’</w:t>
+      </w:r>
+    </w:p>
+    <w:p>
+      <w:pPr>
+        <w:spacing w:line="360" w:lineRule="auto"/>
+        <w:rPr>
+          <w:rFonts w:ascii="Times New Roman" w:hAnsi="Times New Roman" w:cs="Times New Roman"/>
+        </w:rPr>
+      </w:pPr>
+      <w:r>
+        <w:rPr>
+          <w:rFonts w:ascii="Times New Roman" w:hAnsi="Times New Roman" w:cs="Times New Roman"/>
+        </w:rPr>
+        <w:drawing>
+          <wp:inline distT="0" distB="0" distL="0" distR="0" wp14:anchorId="09F4021C" wp14:editId="0ABCE74D">
+            <wp:extent cx="5943600" cy="1537335"/>
+            <wp:effectExtent l="0" t="0" r="0" b="0"/>
+            <wp:docPr id="21" name="Picture 21" descr="Graphical user interface, application, Teams&#10;&#10;Description automatically generated"/>
+            <wp:cNvGraphicFramePr>
+              <a:graphicFrameLocks xmlns:a="http://schemas.openxmlformats.org/drawingml/2006/main" noChangeAspect="1"/>
+            </wp:cNvGraphicFramePr>
+            <a:graphic xmlns:a="http://schemas.openxmlformats.org/drawingml/2006/main">
+              <a:graphicData uri="http://schemas.openxmlformats.org/drawingml/2006/picture">
+                <pic:pic xmlns:pic="http://schemas.openxmlformats.org/drawingml/2006/picture">
+                  <pic:nvPicPr>
+                    <pic:cNvPr id="21" name="Picture 21" descr="Graphical user interface, application, Teams&#10;&#10;Description automatically generated"/>
+                    <pic:cNvPicPr/>
+                  </pic:nvPicPr>
+                  <pic:blipFill>
+                    <a:blip r:embed="rId17"/>
+                    <a:stretch>
+                      <a:fillRect/>
+                    </a:stretch>
+                  </pic:blipFill>
+                  <pic:spPr>
+                    <a:xfrm>
+                      <a:off x="0" y="0"/>
+                      <a:ext cx="5943600" cy="1537335"/>
+                    </a:xfrm>
+                    <a:prstGeom prst="rect">
+                      <a:avLst/>
+                    </a:prstGeom>
+                  </pic:spPr>
+                </pic:pic>
+              </a:graphicData>
+            </a:graphic>
+          </wp:inline>
+        </w:drawing>
+      </w:r>
+    </w:p>
+    <w:p>
+      <w:pPr>
+        <w:spacing w:line="360" w:lineRule="auto"/>
+        <w:rPr>
+          <w:rFonts w:ascii="Times New Roman" w:hAnsi="Times New Roman" w:cs="Times New Roman"/>
+        </w:rPr>
+      </w:pPr>
+    </w:p>
+    <w:p>
+      <w:pPr>
+        <w:spacing w:line="360" w:lineRule="auto"/>
+        <w:rPr>
+          <w:rFonts w:ascii="Times New Roman" w:hAnsi="Times New Roman" w:cs="Times New Roman"/>
+        </w:rPr>
+      </w:pPr>
+      <w:r>
+        <w:rPr>
+          <w:rFonts w:ascii="Times New Roman" w:hAnsi="Times New Roman" w:cs="Times New Roman"/>
+        </w:rPr>
+        <w:t>Q8. What are they doing on the site? (Hint: Look for User-Agent in the web</w:t>
+      </w:r>
+      <w:r>
+        <w:rPr>
+          <w:rFonts w:ascii="Times New Roman" w:hAnsi="Times New Roman" w:cs="Times New Roman"/>
+          <w:lang w:val="en-US"/>
+        </w:rPr>
+        <w:t xml:space="preserve"> </w:t>
+      </w:r>
+      <w:r>
+        <w:rPr>
+          <w:rFonts w:ascii="Times New Roman" w:hAnsi="Times New Roman" w:cs="Times New Roman"/>
+        </w:rPr>
+        <w:t>access.logs.)</w:t>
+      </w:r>
+    </w:p>
+    <w:p>
+      <w:pPr>
+        <w:pStyle w:val="ListParagraph"/>
+        <w:numPr>
+          <w:ilvl w:val="0"/>
+          <w:numId w:val="2"/>
+        </w:numPr>
+        <w:spacing w:line="360" w:lineRule="auto"/>
+        <w:rPr>
+          <w:rFonts w:ascii="Times New Roman" w:hAnsi="Times New Roman" w:cs="Times New Roman"/>
+          <w:color w:val="4472C4" w:themeColor="accent1"/>
+          <w:lang w:val="en-US"/>
+        </w:rPr>
+      </w:pPr>
+      <w:r>
+        <w:rPr>
+          <w:rFonts w:ascii="Times New Roman" w:hAnsi="Times New Roman" w:cs="Times New Roman"/>
+          <w:color w:val="4472C4" w:themeColor="accent1"/>
+          <w:lang w:val="en-US"/>
+        </w:rPr>
+        <w:t xml:space="preserve">They accessed to </w:t>
+      </w:r>
+      <w:r>
+        <w:rPr>
+          <w:rFonts w:ascii="Times New Roman" w:hAnsi="Times New Roman" w:cs="Times New Roman"/>
+          <w:color w:val="4472C4" w:themeColor="accent1"/>
+          <w:lang w:val="en-US"/>
+        </w:rPr>
+        <w:t>files and</w:t>
+      </w:r>
+      <w:r>
+        <w:rPr>
+          <w:rFonts w:ascii="Times New Roman" w:hAnsi="Times New Roman" w:cs="Times New Roman"/>
+          <w:color w:val="4472C4" w:themeColor="accent1"/>
+          <w:lang w:val="en-US"/>
+        </w:rPr>
+        <w:t xml:space="preserve"> send API requests which were allowed by the webserver to unregistered user (as a bot).</w:t>
+      </w:r>
+    </w:p>
+    <w:p>
+      <w:pPr>
+        <w:spacing w:line="360" w:lineRule="auto"/>
+        <w:rPr>
+          <w:rFonts w:ascii="Times New Roman" w:hAnsi="Times New Roman" w:cs="Times New Roman"/>
+        </w:rPr>
+      </w:pPr>
+      <w:r>
+        <w:rPr>
+          <w:rFonts w:ascii="Times New Roman" w:hAnsi="Times New Roman" w:cs="Times New Roman"/>
+        </w:rPr>
+        <w:drawing>
+          <wp:inline distT="0" distB="0" distL="0" distR="0" wp14:anchorId="6473E883" wp14:editId="705466E7">
+            <wp:extent cx="5943600" cy="2239010"/>
+            <wp:effectExtent l="0" t="0" r="0" b="0"/>
+            <wp:docPr id="23" name="Picture 23" descr="Graphical user interface, text&#10;&#10;Description automatically generated"/>
+            <wp:cNvGraphicFramePr>
+              <a:graphicFrameLocks xmlns:a="http://schemas.openxmlformats.org/drawingml/2006/main" noChangeAspect="1"/>
+            </wp:cNvGraphicFramePr>
+            <a:graphic xmlns:a="http://schemas.openxmlformats.org/drawingml/2006/main">
+              <a:graphicData uri="http://schemas.openxmlformats.org/drawingml/2006/picture">
+                <pic:pic xmlns:pic="http://schemas.openxmlformats.org/drawingml/2006/picture">
+                  <pic:nvPicPr>
+                    <pic:cNvPr id="23" name="Picture 23" descr="Graphical user interface, text&#10;&#10;Description automatically generated"/>
+                    <pic:cNvPicPr/>
+                  </pic:nvPicPr>
+                  <pic:blipFill>
+                    <a:blip r:embed="rId18"/>
+                    <a:stretch>
+                      <a:fillRect/>
+                    </a:stretch>
+                  </pic:blipFill>
+                  <pic:spPr>
+                    <a:xfrm>
+                      <a:off x="0" y="0"/>
+                      <a:ext cx="5943600" cy="2239010"/>
+                    </a:xfrm>
+                    <a:prstGeom prst="rect">
+                      <a:avLst/>
+                    </a:prstGeom>
+                  </pic:spPr>
+                </pic:pic>
+              </a:graphicData>
+            </a:graphic>
+          </wp:inline>
+        </w:drawing>
+      </w:r>
     </w:p>
     <w:sectPr>
       <w:pgSz w:w="12240" w:h="15840"/>
@@ -1168,6 +2372,118 @@
       </w:rPr>
     </w:lvl>
   </w:abstractNum>
+  <w:abstractNum w:abstractNumId="3" w15:restartNumberingAfterBreak="0">
+    <w:nsid w:val="6B6C5280"/>
+    <w:multiLevelType w:val="hybridMultilevel"/>
+    <w:tmpl w:val="3762FDC4"/>
+    <w:lvl w:ilvl="0" w:tplc="46B896A8">
+      <w:numFmt w:val="bullet"/>
+      <w:lvlText w:val="-"/>
+      <w:lvlJc w:val="left"/>
+      <w:pPr>
+        <w:ind w:left="720" w:hanging="360"/>
+      </w:pPr>
+      <w:rPr>
+        <w:rFonts w:ascii="Times New Roman" w:eastAsiaTheme="minorHAnsi" w:hAnsi="Times New Roman" w:cs="Times New Roman" w:hint="default"/>
+      </w:rPr>
+    </w:lvl>
+    <w:lvl w:ilvl="1" w:tplc="04090003" w:tentative="1">
+      <w:start w:val="1"/>
+      <w:numFmt w:val="bullet"/>
+      <w:lvlText w:val="o"/>
+      <w:lvlJc w:val="left"/>
+      <w:pPr>
+        <w:ind w:left="1440" w:hanging="360"/>
+      </w:pPr>
+      <w:rPr>
+        <w:rFonts w:ascii="Courier New" w:hAnsi="Courier New" w:cs="Courier New" w:hint="default"/>
+      </w:rPr>
+    </w:lvl>
+    <w:lvl w:ilvl="2" w:tplc="04090005" w:tentative="1">
+      <w:start w:val="1"/>
+      <w:numFmt w:val="bullet"/>
+      <w:lvlText w:val=""/>
+      <w:lvlJc w:val="left"/>
+      <w:pPr>
+        <w:ind w:left="2160" w:hanging="360"/>
+      </w:pPr>
+      <w:rPr>
+        <w:rFonts w:ascii="Wingdings" w:hAnsi="Wingdings" w:hint="default"/>
+      </w:rPr>
+    </w:lvl>
+    <w:lvl w:ilvl="3" w:tplc="04090001" w:tentative="1">
+      <w:start w:val="1"/>
+      <w:numFmt w:val="bullet"/>
+      <w:lvlText w:val=""/>
+      <w:lvlJc w:val="left"/>
+      <w:pPr>
+        <w:ind w:left="2880" w:hanging="360"/>
+      </w:pPr>
+      <w:rPr>
+        <w:rFonts w:ascii="Symbol" w:hAnsi="Symbol" w:hint="default"/>
+      </w:rPr>
+    </w:lvl>
+    <w:lvl w:ilvl="4" w:tplc="04090003" w:tentative="1">
+      <w:start w:val="1"/>
+      <w:numFmt w:val="bullet"/>
+      <w:lvlText w:val="o"/>
+      <w:lvlJc w:val="left"/>
+      <w:pPr>
+        <w:ind w:left="3600" w:hanging="360"/>
+      </w:pPr>
+      <w:rPr>
+        <w:rFonts w:ascii="Courier New" w:hAnsi="Courier New" w:cs="Courier New" w:hint="default"/>
+      </w:rPr>
+    </w:lvl>
+    <w:lvl w:ilvl="5" w:tplc="04090005" w:tentative="1">
+      <w:start w:val="1"/>
+      <w:numFmt w:val="bullet"/>
+      <w:lvlText w:val=""/>
+      <w:lvlJc w:val="left"/>
+      <w:pPr>
+        <w:ind w:left="4320" w:hanging="360"/>
+      </w:pPr>
+      <w:rPr>
+        <w:rFonts w:ascii="Wingdings" w:hAnsi="Wingdings" w:hint="default"/>
+      </w:rPr>
+    </w:lvl>
+    <w:lvl w:ilvl="6" w:tplc="04090001" w:tentative="1">
+      <w:start w:val="1"/>
+      <w:numFmt w:val="bullet"/>
+      <w:lvlText w:val=""/>
+      <w:lvlJc w:val="left"/>
+      <w:pPr>
+        <w:ind w:left="5040" w:hanging="360"/>
+      </w:pPr>
+      <w:rPr>
+        <w:rFonts w:ascii="Symbol" w:hAnsi="Symbol" w:hint="default"/>
+      </w:rPr>
+    </w:lvl>
+    <w:lvl w:ilvl="7" w:tplc="04090003" w:tentative="1">
+      <w:start w:val="1"/>
+      <w:numFmt w:val="bullet"/>
+      <w:lvlText w:val="o"/>
+      <w:lvlJc w:val="left"/>
+      <w:pPr>
+        <w:ind w:left="5760" w:hanging="360"/>
+      </w:pPr>
+      <w:rPr>
+        <w:rFonts w:ascii="Courier New" w:hAnsi="Courier New" w:cs="Courier New" w:hint="default"/>
+      </w:rPr>
+    </w:lvl>
+    <w:lvl w:ilvl="8" w:tplc="04090005" w:tentative="1">
+      <w:start w:val="1"/>
+      <w:numFmt w:val="bullet"/>
+      <w:lvlText w:val=""/>
+      <w:lvlJc w:val="left"/>
+      <w:pPr>
+        <w:ind w:left="6480" w:hanging="360"/>
+      </w:pPr>
+      <w:rPr>
+        <w:rFonts w:ascii="Wingdings" w:hAnsi="Wingdings" w:hint="default"/>
+      </w:rPr>
+    </w:lvl>
+  </w:abstractNum>
   <w:num w:numId="1" w16cid:durableId="1918660947">
     <w:abstractNumId w:val="1"/>
   </w:num>
@@ -1176,6 +2492,9 @@
   </w:num>
   <w:num w:numId="3" w16cid:durableId="1683706107">
     <w:abstractNumId w:val="0"/>
+  </w:num>
+  <w:num w:numId="4" w16cid:durableId="668213510">
+    <w:abstractNumId w:val="3"/>
   </w:num>
 </w:numbering>
 </file>
@@ -1639,6 +2958,18 @@
       <w:contextualSpacing/>
     </w:pPr>
   </w:style>
+  <w:style w:type="character" w:styleId="FollowedHyperlink">
+    <w:name w:val="FollowedHyperlink"/>
+    <w:basedOn w:val="DefaultParagraphFont"/>
+    <w:uiPriority w:val="99"/>
+    <w:semiHidden/>
+    <w:unhideWhenUsed/>
+    <w:rsid w:val="00F94832"/>
+    <w:rPr>
+      <w:color w:val="954F72" w:themeColor="followedHyperlink"/>
+      <w:u w:val="single"/>
+    </w:rPr>
+  </w:style>
 </w:styles>
 </file>
 

</xml_diff>